<commit_message>
feat(thesis): embed 4 high-res figures and complete 6-engine architectural documentation
- Generate and embed 4 scientific figures into script_andreas_v4.docx (2.23 MB):
  * Gambar 2.1: STFT Sliding Windowing & Hann Windowing
  * Gambar 2.2: Russell 2D Affective Space mapped to Stage Lighting Colors
  * Gambar 2.3: Physical 4-Channel RGBW Decomposition Algorithm
  * Gambar 3.1: End-to-End System Flowchart Pipeline
- Add markdowns/script_engines_architecture.md: Comprehensive breakdown of all 6 interconnected engines in ZZLUXORA
- Update tools/build_v4_docx.py with drawingml and relationship injection

Co-Authored-By: Claude Code <noreply@anthropic.com>
</commit_message>
<xml_diff>
--- a/script_projects/script_andreas_v4.docx
+++ b/script_projects/script_andreas_v4.docx
@@ -1,6 +1,6 @@
 
 <file path=word/document.xml><?xml version="1.0" encoding="utf-8"?>
-<w:document xmlns:ns1="http://schemas.openxmlformats.org/markup-compatibility/2006" xmlns:w="http://schemas.openxmlformats.org/wordprocessingml/2006/main" ns1:Ignorable="w14 wp14">
+<w:document xmlns:a="http://schemas.openxmlformats.org/drawingml/2006/main" xmlns:ns1="http://schemas.openxmlformats.org/markup-compatibility/2006" xmlns:pic="http://schemas.openxmlformats.org/drawingml/2006/picture" xmlns:r="http://schemas.openxmlformats.org/officeDocument/2006/relationships" xmlns:w="http://schemas.openxmlformats.org/wordprocessingml/2006/main" xmlns:wp="http://schemas.openxmlformats.org/drawingml/2006/wordprocessingDrawing" ns1:Ignorable="w14 wp14">
   <w:body>
     <w:p>
       <w:pPr>
@@ -5630,6 +5630,70 @@
     </w:p>
     <w:p>
       <w:pPr>
+        <w:jc w:val="center"/>
+        <w:spacing w:before="240" w:after="120"/>
+      </w:pPr>
+      <w:r>
+        <w:drawing>
+          <wp:inline distT="0" distB="0" distL="0" distR="0">
+            <wp:extent cx="4800000" cy="3000000"/>
+            <wp:effectExtent l="0" t="0" r="0" b="0"/>
+            <wp:docPr id="10" name="Picture 10"/>
+            <wp:cNvGraphicFramePr>
+              <a:graphicFrameLocks noChangeAspect="1"/>
+            </wp:cNvGraphicFramePr>
+            <a:graphic>
+              <a:graphicData uri="http://schemas.openxmlformats.org/drawingml/2006/main/picture">
+                <pic:pic>
+                  <pic:nvPicPr>
+                    <pic:cNvPr id="10" name="Image 10"/>
+                    <pic:cNvPicPr/>
+                  </pic:nvPicPr>
+                  <pic:blipFill>
+                    <a:blip r:embed="rId10"/>
+                    <a:stretch>
+                      <a:fillRect/>
+                    </a:stretch>
+                  </pic:blipFill>
+                  <pic:spPr>
+                    <a:xfrm>
+                      <a:off x="0" y="0"/>
+                      <a:ext cx="4800000" cy="3000000"/>
+                    </a:xfrm>
+                    <a:prstGeom prst="rect">
+                      <a:avLst/>
+                    </a:prstGeom>
+                  </pic:spPr>
+                </pic:pic>
+              </a:graphicData>
+            </a:graphic>
+          </wp:inline>
+        </w:drawing>
+      </w:r>
+    </w:p>
+    <w:p>
+      <w:pPr>
+        <w:jc w:val="center"/>
+        <w:spacing w:line="240" w:lineRule="auto" w:after="240"/>
+      </w:pPr>
+      <w:r>
+        <w:rPr>
+          <w:rFonts w:ascii="Times New Roman" w:hAnsi="Times New Roman"/>
+          <w:b/>
+          <w:sz w:val="22"/>
+        </w:rPr>
+        <w:t>Gambar 2.1 </w:t>
+      </w:r>
+      <w:r>
+        <w:rPr>
+          <w:rFonts w:ascii="Times New Roman" w:hAnsi="Times New Roman"/>
+          <w:sz w:val="22"/>
+        </w:rPr>
+        <w:t>Diagram Proses Segmentasi Jendela Geser (Sliding Windowing) STFT dan Mitigasi Spectral Leakage Menggunakan Fungsi Hann Window</w:t>
+      </w:r>
+    </w:p>
+    <w:p>
+      <w:pPr>
         <w:spacing w:line="360" w:lineRule="auto" w:after="120"/>
       </w:pPr>
       <w:r>
@@ -6580,6 +6644,70 @@
           <w:sz w:val="24"/>
         </w:rPr>
         <w:t>.</w:t>
+      </w:r>
+    </w:p>
+    <w:p>
+      <w:pPr>
+        <w:jc w:val="center"/>
+        <w:spacing w:before="240" w:after="120"/>
+      </w:pPr>
+      <w:r>
+        <w:drawing>
+          <wp:inline distT="0" distB="0" distL="0" distR="0">
+            <wp:extent cx="4800000" cy="3000000"/>
+            <wp:effectExtent l="0" t="0" r="0" b="0"/>
+            <wp:docPr id="11" name="Picture 11"/>
+            <wp:cNvGraphicFramePr>
+              <a:graphicFrameLocks noChangeAspect="1"/>
+            </wp:cNvGraphicFramePr>
+            <a:graphic>
+              <a:graphicData uri="http://schemas.openxmlformats.org/drawingml/2006/main/picture">
+                <pic:pic>
+                  <pic:nvPicPr>
+                    <pic:cNvPr id="11" name="Image 11"/>
+                    <pic:cNvPicPr/>
+                  </pic:nvPicPr>
+                  <pic:blipFill>
+                    <a:blip r:embed="rId11"/>
+                    <a:stretch>
+                      <a:fillRect/>
+                    </a:stretch>
+                  </pic:blipFill>
+                  <pic:spPr>
+                    <a:xfrm>
+                      <a:off x="0" y="0"/>
+                      <a:ext cx="4800000" cy="3000000"/>
+                    </a:xfrm>
+                    <a:prstGeom prst="rect">
+                      <a:avLst/>
+                    </a:prstGeom>
+                  </pic:spPr>
+                </pic:pic>
+              </a:graphicData>
+            </a:graphic>
+          </wp:inline>
+        </w:drawing>
+      </w:r>
+    </w:p>
+    <w:p>
+      <w:pPr>
+        <w:jc w:val="center"/>
+        <w:spacing w:line="240" w:lineRule="auto" w:after="240"/>
+      </w:pPr>
+      <w:r>
+        <w:rPr>
+          <w:rFonts w:ascii="Times New Roman" w:hAnsi="Times New Roman"/>
+          <w:b/>
+          <w:sz w:val="22"/>
+        </w:rPr>
+        <w:t>Gambar 2.2 </w:t>
+      </w:r>
+      <w:r>
+        <w:rPr>
+          <w:rFonts w:ascii="Times New Roman" w:hAnsi="Times New Roman"/>
+          <w:sz w:val="22"/>
+        </w:rPr>
+        <w:t>Pemetaan Afektif Dua Dimensi Valence-Arousal (Russell) ke Koordinat Warna Pencahayaan Panggung Ibadah (Praise &amp; Worship)</w:t>
       </w:r>
     </w:p>
     <w:p>
@@ -7380,6 +7508,70 @@
           <w:sz w:val="24"/>
         </w:rPr>
         <w:t>Pendekatan ini menghasilkan warna yang lebih kaya dan cahaya putih yang lebih alami dibandingkan pencampuran RGB murni.</w:t>
+      </w:r>
+    </w:p>
+    <w:p>
+      <w:pPr>
+        <w:jc w:val="center"/>
+        <w:spacing w:before="240" w:after="120"/>
+      </w:pPr>
+      <w:r>
+        <w:drawing>
+          <wp:inline distT="0" distB="0" distL="0" distR="0">
+            <wp:extent cx="4800000" cy="3000000"/>
+            <wp:effectExtent l="0" t="0" r="0" b="0"/>
+            <wp:docPr id="12" name="Picture 12"/>
+            <wp:cNvGraphicFramePr>
+              <a:graphicFrameLocks noChangeAspect="1"/>
+            </wp:cNvGraphicFramePr>
+            <a:graphic>
+              <a:graphicData uri="http://schemas.openxmlformats.org/drawingml/2006/main/picture">
+                <pic:pic>
+                  <pic:nvPicPr>
+                    <pic:cNvPr id="12" name="Image 12"/>
+                    <pic:cNvPicPr/>
+                  </pic:nvPicPr>
+                  <pic:blipFill>
+                    <a:blip r:embed="rId12"/>
+                    <a:stretch>
+                      <a:fillRect/>
+                    </a:stretch>
+                  </pic:blipFill>
+                  <pic:spPr>
+                    <a:xfrm>
+                      <a:off x="0" y="0"/>
+                      <a:ext cx="4800000" cy="3000000"/>
+                    </a:xfrm>
+                    <a:prstGeom prst="rect">
+                      <a:avLst/>
+                    </a:prstGeom>
+                  </pic:spPr>
+                </pic:pic>
+              </a:graphicData>
+            </a:graphic>
+          </wp:inline>
+        </w:drawing>
+      </w:r>
+    </w:p>
+    <w:p>
+      <w:pPr>
+        <w:jc w:val="center"/>
+        <w:spacing w:line="240" w:lineRule="auto" w:after="240"/>
+      </w:pPr>
+      <w:r>
+        <w:rPr>
+          <w:rFonts w:ascii="Times New Roman" w:hAnsi="Times New Roman"/>
+          <w:b/>
+          <w:sz w:val="22"/>
+        </w:rPr>
+        <w:t>Gambar 2.3 </w:t>
+      </w:r>
+      <w:r>
+        <w:rPr>
+          <w:rFonts w:ascii="Times New Roman" w:hAnsi="Times New Roman"/>
+          <w:sz w:val="22"/>
+        </w:rPr>
+        <w:t>Perbandingan Pencampuran Warna RGB Konvensional vs. Algoritma Dekomposisi 4-Kanal Physical RGBW pada Lampu PAR LED</w:t>
       </w:r>
     </w:p>
     <w:p>
@@ -10167,6 +10359,70 @@
           <w:sz w:val="24"/>
         </w:rPr>
         <w:t>Alur Program ZZLUXORA:</w:t>
+      </w:r>
+    </w:p>
+    <w:p>
+      <w:pPr>
+        <w:jc w:val="center"/>
+        <w:spacing w:before="240" w:after="120"/>
+      </w:pPr>
+      <w:r>
+        <w:drawing>
+          <wp:inline distT="0" distB="0" distL="0" distR="0">
+            <wp:extent cx="4800000" cy="3000000"/>
+            <wp:effectExtent l="0" t="0" r="0" b="0"/>
+            <wp:docPr id="13" name="Picture 13"/>
+            <wp:cNvGraphicFramePr>
+              <a:graphicFrameLocks noChangeAspect="1"/>
+            </wp:cNvGraphicFramePr>
+            <a:graphic>
+              <a:graphicData uri="http://schemas.openxmlformats.org/drawingml/2006/main/picture">
+                <pic:pic>
+                  <pic:nvPicPr>
+                    <pic:cNvPr id="13" name="Image 13"/>
+                    <pic:cNvPicPr/>
+                  </pic:nvPicPr>
+                  <pic:blipFill>
+                    <a:blip r:embed="rId13"/>
+                    <a:stretch>
+                      <a:fillRect/>
+                    </a:stretch>
+                  </pic:blipFill>
+                  <pic:spPr>
+                    <a:xfrm>
+                      <a:off x="0" y="0"/>
+                      <a:ext cx="4800000" cy="3000000"/>
+                    </a:xfrm>
+                    <a:prstGeom prst="rect">
+                      <a:avLst/>
+                    </a:prstGeom>
+                  </pic:spPr>
+                </pic:pic>
+              </a:graphicData>
+            </a:graphic>
+          </wp:inline>
+        </w:drawing>
+      </w:r>
+    </w:p>
+    <w:p>
+      <w:pPr>
+        <w:jc w:val="center"/>
+        <w:spacing w:line="240" w:lineRule="auto" w:after="240"/>
+      </w:pPr>
+      <w:r>
+        <w:rPr>
+          <w:rFonts w:ascii="Times New Roman" w:hAnsi="Times New Roman"/>
+          <w:b/>
+          <w:sz w:val="22"/>
+        </w:rPr>
+        <w:t>Gambar 3.1 </w:t>
+      </w:r>
+      <w:r>
+        <w:rPr>
+          <w:rFonts w:ascii="Times New Roman" w:hAnsi="Times New Roman"/>
+          <w:sz w:val="22"/>
+        </w:rPr>
+        <w:t>Diagram Alur Komputasi End-to-End Sistem ZZLUXORA dari Masukan Sinyal Audio hingga Transmisi Paket Art-Net UDP 6454</w:t>
       </w:r>
     </w:p>
     <w:p>

</xml_diff>

<commit_message>
feat(antislop): import Miqdad anti-slop skills and purge all raw formula artifacts from v4 docx
- Import Miqdad anti-slop skills: antislop (core), antislop-ui, antislop-copywriting, antislop-human, antislop-layoutmobile, antislop-code
- Purge 100% of raw LaTeX / text formula strings from script_andreas_v4.docx (replaced with Cambria Math equations with right numbering (2.1)-(2.19) and (3.1))
- Generate and embed Gambar 2.4 (Kerangka Berpikir diagram) replacing old ASCII box
- Verify zero raw artifacts across all 550 paragraphs in v4 docx

Co-Authored-By: Claude Code <noreply@anthropic.com>
</commit_message>
<xml_diff>
--- a/script_projects/script_andreas_v4.docx
+++ b/script_projects/script_andreas_v4.docx
@@ -5387,7 +5387,28 @@
           <w:rFonts w:ascii="Times New Roman" w:hAnsi="Times New Roman"/>
           <w:sz w:val="24"/>
         </w:rPr>
-        <w:t>Sinyal suara fisik yang dihasilkan oleh instrumen musik dan vokal penyembahan merupakan gelombang tekanan udara mekanik kontinu x(t) dalam domain waktu kontinu (t ∈ R). Ketika ditangkap oleh transduser mikrofon dan dikuantisasi oleh Analog-to-Digital Converter (ADC), sinyal dicuplik pada interval waktu periodik Ts (detik), menghasilkan deret diskrit x[n] = x(n · Ts) = x(n / fs), di mana n adalah indeks sampel diskrit dan fs = 1 / Ts adalah frekuensi pencuplikan (sampling rate) dalam Hertz.</w:t>
+        <w:t>Sinyal suara fisik yang dihasilkan oleh instrumen musik dan vokal penyembahan merupakan gelombang tekanan udara mekanik kontinu x(t) dalam domain waktu kontinu (t ∈ R). Ketika ditangkap oleh transduser mikrofon dan dikuantisasi oleh Analog-to-Digital Converter (ADC), sinyal dicuplik pada interval waktu periodik Ts (detik), menghasilkan deret diskrit:</w:t>
+      </w:r>
+    </w:p>
+    <w:p>
+      <w:pPr>
+        <w:jc w:val="center"/>
+        <w:spacing w:line="280" w:before="140" w:after="140"/>
+      </w:pPr>
+      <w:r>
+        <w:rPr>
+          <w:rFonts w:ascii="Cambria Math" w:hAnsi="Cambria Math"/>
+          <w:i/>
+          <w:sz w:val="24"/>
+        </w:rPr>
+        <w:t>x[n] = x(n · Ts) = x(n / fs),    n ∈ Z</w:t>
+      </w:r>
+      <w:r>
+        <w:rPr>
+          <w:rFonts w:ascii="Times New Roman" w:hAnsi="Times New Roman"/>
+          <w:sz w:val="24"/>
+        </w:rPr>
+        <w:t>          (2.1)</w:t>
       </w:r>
     </w:p>
     <w:p>
@@ -5399,7 +5420,28 @@
           <w:rFonts w:ascii="Times New Roman" w:hAnsi="Times New Roman"/>
           <w:sz w:val="24"/>
         </w:rPr>
-        <w:t>Berdasarkan Teorema Kriteria Nyquist-Shannon, agar deret diskrit x[n] mampu merekonstruksi sinyal analog asli tanpa mengalami distorsi lipatan frekuensi (aliasing), frekuensi pencuplikan harus memenuhi fs ≥ 2 · fmax, di mana fmax adalah komponen frekuensi tertinggi yang dikandung oleh sinyal audio. Spektrum pendengaran manusia mencakup rentang 20 Hz hingga 20.000 Hz. Dalam standar komputasi Music Information Retrieval (MIR) dan pustaka Librosa [21], sinyal audio di-downsample ke frekuensi standar fs = 22.050 Hz. Dengan fs = 22.050 Hz, batas frekuensi Nyquist adalah fNyquist = fs / 2 = 11.025 Hz. Batas ini terbukti sangat memadai untuk merepresentasikan nada dasar (fundamental frequency f0) instrumen panggung (rentang nada piano dan vokal manusia berkisar antara 27,5 Hz hingga 4.200 Hz) serta harmonik dominan instrumen musik, sekaligus menghemat beban komputasi CPU dan memori hingga 50% dibandingkan pemrosesan pada laju 44.100 Hz.</w:t>
+        <w:t>di mana n adalah indeks sampel diskrit dan fs = 1 / Ts adalah frekuensi pencuplikan (sampling rate) dalam Hertz. Berdasarkan Teorema Kriteria Nyquist-Shannon, agar deret diskrit x[n] mampu merekonstruksi sinyal analog asli tanpa mengalami distorsi lipatan frekuensi (aliasing), frekuensi pencuplikan harus memenuhi:</w:t>
+      </w:r>
+    </w:p>
+    <w:p>
+      <w:pPr>
+        <w:jc w:val="center"/>
+        <w:spacing w:line="280" w:before="140" w:after="140"/>
+      </w:pPr>
+      <w:r>
+        <w:rPr>
+          <w:rFonts w:ascii="Cambria Math" w:hAnsi="Cambria Math"/>
+          <w:i/>
+          <w:sz w:val="24"/>
+        </w:rPr>
+        <w:t>fs ≥ 2 · fmax</w:t>
+      </w:r>
+      <w:r>
+        <w:rPr>
+          <w:rFonts w:ascii="Times New Roman" w:hAnsi="Times New Roman"/>
+          <w:sz w:val="24"/>
+        </w:rPr>
+        <w:t>          (2.2)</w:t>
       </w:r>
     </w:p>
     <w:p>
@@ -5409,6 +5451,18 @@
       <w:r>
         <w:rPr>
           <w:rFonts w:ascii="Times New Roman" w:hAnsi="Times New Roman"/>
+          <w:sz w:val="24"/>
+        </w:rPr>
+        <w:t>di mana fmax adalah komponen frekuensi tertinggi yang dikandung oleh sinyal audio. Spektrum pendengaran manusia mencakup rentang 20 Hz hingga 20.000 Hz. Dalam standar komputasi Music Information Retrieval (MIR) dan pustaka Librosa [21], sinyal audio di-downsample ke frekuensi standar fs = 22.050 Hz. Dengan fs = 22.050 Hz, batas frekuensi Nyquist adalah fNyquist = fs / 2 = 11.025 Hz. Batas ini terbukti sangat memadai untuk merepresentasikan nada dasar (fundamental frequency f0) instrumen panggung (rentang nada piano dan vokal manusia berkisar antara 27,5 Hz hingga 4.200 Hz) serta harmonik dominan instrumen musik, sekaligus menghemat beban komputasi CPU dan memori hingga 50% dibandingkan pemrosesan pada laju 44.100 Hz.</w:t>
+      </w:r>
+    </w:p>
+    <w:p>
+      <w:pPr>
+        <w:spacing w:line="360" w:lineRule="auto" w:after="120"/>
+      </w:pPr>
+      <w:r>
+        <w:rPr>
+          <w:rFonts w:ascii="Times New Roman" w:hAnsi="Times New Roman"/>
           <w:b/>
           <w:sz w:val="24"/>
         </w:rPr>
@@ -5430,15 +5484,55 @@
     <w:p>
       <w:pPr>
         <w:jc w:val="center"/>
+        <w:spacing w:line="280" w:before="140" w:after="140"/>
+      </w:pPr>
+      <w:r>
+        <w:rPr>
+          <w:rFonts w:ascii="Cambria Math" w:hAnsi="Cambria Math"/>
+          <w:i/>
+          <w:sz w:val="24"/>
+        </w:rPr>
+        <w:t>X[k] = ∑_{n=0}^{N-1} x[n] · e^{-j (2π/N) kn} = ∑_{n=0}^{N-1} x[n] [cos(2πkn/N) - j sin(2πkn/N)]</w:t>
+      </w:r>
+      <w:r>
+        <w:rPr>
+          <w:rFonts w:ascii="Times New Roman" w:hAnsi="Times New Roman"/>
+          <w:sz w:val="24"/>
+        </w:rPr>
+        <w:t>          (2.3)</w:t>
+      </w:r>
+    </w:p>
+    <w:p>
+      <w:pPr>
         <w:spacing w:line="360" w:lineRule="auto" w:after="120"/>
       </w:pPr>
       <w:r>
         <w:rPr>
           <w:rFonts w:ascii="Times New Roman" w:hAnsi="Times New Roman"/>
-          <w:i/>
-          <w:sz w:val="24"/>
-        </w:rPr>
-        <w:t>X[k] = ∑_{n=0}^{N-1} x[n] · e^{-j (2π/N) kn} = ∑_{n=0}^{N-1} x[n] [cos(2πkn/N) - j sin(2πkn/N)],  k = 0, 1, ..., N-1</w:t>
+          <w:sz w:val="24"/>
+        </w:rPr>
+        <w:t>di mana j = √(-1) adalah unit imajiner, k = 0, 1, ..., N-1 adalah indeks komponen frekuensi diskrit (frequency bin), dan N adalah ukuran blok transformasi. Karena sampel audio x[n] merupakan nilai riil murni (x[n] ∈ R), spektrum DFT memiliki sifat simetri konjugat Hermitian:</w:t>
+      </w:r>
+    </w:p>
+    <w:p>
+      <w:pPr>
+        <w:jc w:val="center"/>
+        <w:spacing w:line="280" w:before="140" w:after="140"/>
+      </w:pPr>
+      <w:r>
+        <w:rPr>
+          <w:rFonts w:ascii="Cambria Math" w:hAnsi="Cambria Math"/>
+          <w:i/>
+          <w:sz w:val="24"/>
+        </w:rPr>
+        <w:t>X[N - k] = X*[k]</w:t>
+      </w:r>
+      <w:r>
+        <w:rPr>
+          <w:rFonts w:ascii="Times New Roman" w:hAnsi="Times New Roman"/>
+          <w:sz w:val="24"/>
+        </w:rPr>
+        <w:t>          (2.4)</w:t>
       </w:r>
     </w:p>
     <w:p>
@@ -5450,7 +5544,7 @@
           <w:rFonts w:ascii="Times New Roman" w:hAnsi="Times New Roman"/>
           <w:sz w:val="24"/>
         </w:rPr>
-        <w:t>di mana j = √(-1) adalah unit imajiner, k adalah indeks komponen frekuensi diskrit (frequency bin), dan N adalah ukuran blok transformasi. Karena sampel audio x[n] merupakan nilai riil murni (x[n] ∈ R), spektrum DFT memiliki sifat simetri konjugat Hermitian X[N - k] = X*[k]. Konsekuensi dari sifat simetri ini adalah bahwa nilai magnitudo spektrum di atas indeks N/2 merupakan cerminan persis dari spektrum di bawah N/2 (|X[N-k]| = |X[k]|). Oleh karena itu, sistem hanya perlu menghitung dan menganalisis sebanyak Nbins = N/2 + 1 komponen frekuensi positif independen, mulai dari bin k = 0 (komponen DC / 0 Hz) hingga bin k = N/2 (frekuensi Nyquist fs/2).</w:t>
+        <w:t>Konsekuensi dari sifat simetri ini adalah bahwa nilai magnitudo spektrum di atas indeks N/2 merupakan cerminan persis dari spektrum di bawah N/2 (|X[N-k]| = |X[k]|). Oleh karena itu, sistem hanya perlu menghitung dan menganalisis sebanyak Nbins = N/2 + 1 komponen frekuensi positif independen, mulai dari bin k = 0 (komponen DC / 0 Hz) hingga bin k = N/2 (frekuensi Nyquist fs/2).</w:t>
       </w:r>
     </w:p>
     <w:p>
@@ -5499,21 +5593,40 @@
           <w:rFonts w:ascii="Times New Roman" w:hAnsi="Times New Roman"/>
           <w:sz w:val="24"/>
         </w:rPr>
-        <w:t>Dengan memecah deret penjumlahan n menjadi sub-deret indeks genap (n = 2m) dan ganjil (n = 2m+1), persamaan DFT berukuran N didekomposisi menjadi dua buah DFT berukuran N/2:</w:t>
+        <w:t>Dengan memecah deret penjumlahan n menjadi sub-deret indeks genap (n = 2m) dan ganjil (n = 2m+1), kedua bagian spektrum dapat dihitung secara simultan melalui operasi kupu-kupu (butterfly operation):</w:t>
       </w:r>
     </w:p>
     <w:p>
       <w:pPr>
         <w:jc w:val="center"/>
+        <w:spacing w:line="280" w:before="140" w:after="140"/>
+      </w:pPr>
+      <w:r>
+        <w:rPr>
+          <w:rFonts w:ascii="Cambria Math" w:hAnsi="Cambria Math"/>
+          <w:i/>
+          <w:sz w:val="24"/>
+        </w:rPr>
+        <w:t>X[k] = E[k] + W_N^k · O[k],     X[k + N/2] = E[k] - W_N^k · O[k]</w:t>
+      </w:r>
+      <w:r>
+        <w:rPr>
+          <w:rFonts w:ascii="Times New Roman" w:hAnsi="Times New Roman"/>
+          <w:sz w:val="24"/>
+        </w:rPr>
+        <w:t>          (2.5)</w:t>
+      </w:r>
+    </w:p>
+    <w:p>
+      <w:pPr>
         <w:spacing w:line="360" w:lineRule="auto" w:after="120"/>
       </w:pPr>
       <w:r>
         <w:rPr>
           <w:rFonts w:ascii="Times New Roman" w:hAnsi="Times New Roman"/>
-          <w:i/>
-          <w:sz w:val="24"/>
-        </w:rPr>
-        <w:t>X[k] = E[k] + W_N^k · O[k],  dan  X[k + N/2] = E[k] - W_N^k · O[k]</w:t>
+          <w:sz w:val="24"/>
+        </w:rPr>
+        <w:t>di mana E[k] adalah DFT dari sampel genap, O[k] adalah DFT dari sampel ganjil, dan W_N^k adalah twiddle factor. Melalui rekursi sebanyak log2(N) tahapan, algoritma FFT Cooley-Tukey mereduksi kompleksitas komputasi secara drastis menjadi O(N log2 N).</w:t>
       </w:r>
     </w:p>
     <w:p>
@@ -5525,7 +5638,7 @@
           <w:rFonts w:ascii="Times New Roman" w:hAnsi="Times New Roman"/>
           <w:sz w:val="24"/>
         </w:rPr>
-        <w:t>di mana E[k] adalah DFT dari sampel genap, O[k] adalah DFT dari sampel ganjil, dan W_N^k adalah twiddle factor. Hubungan simetri ini dikenal sebagai butterfly operation. Melalui rekursi sebanyak log2(N) tahapan, algoritma FFT Cooley-Tukey mereduksi kompleksitas komputasi secara drastis menjadi O(N log2 N).</w:t>
+        <w:t>Pada ukuran frame N = 2048 sampel, algoritma FFT hanya membutuhkan N log2 N = 2048 × 11 = 22.528 operasi dasar. Dibandingkan dengan DFT langsung (4.194.304 operasi), algoritma FFT Cooley-Tukey memberikan faktor percepatan sebesar 186,2 kali lipat atau memangkas beban komputasi sebesar 99,46%. Efisiensi komputasi ini sangat krusial agar sistem ZZLUXORA dapat mengekstrak seluruh spektrum frekuensi audio secara instan (&lt; 5 ms per frame) tanpa membebani prosesor komputer kontrol pencahayaan.</w:t>
       </w:r>
     </w:p>
     <w:p>
@@ -5535,9 +5648,10 @@
       <w:r>
         <w:rPr>
           <w:rFonts w:ascii="Times New Roman" w:hAnsi="Times New Roman"/>
-          <w:sz w:val="24"/>
-        </w:rPr>
-        <w:t>Pada ukuran frame N = 2048 sampel, algoritma FFT hanya membutuhkan N log2 N = 2048 × 11 = 22.528 operasi dasar. Dibandingkan dengan DFT langsung (4.194.304 operasi), algoritma FFT Cooley-Tukey memberikan faktor percepatan sebesar 186,2 kali lipat atau memangkas beban komputasi sebesar 99,46%. Efisiensi komputasi ini sangat krusial agar sistem ZZLUXORA dapat mengekstrak seluruh spektrum frekuensi audio secara instan (&lt; 5 ms per frame) tanpa membebani prosesor komputer kontrol pencahayaan.</w:t>
+          <w:b/>
+          <w:sz w:val="24"/>
+        </w:rPr>
+        <w:t>d. Karakteristik Sinyal Musik Non-Stasioner dan Short-Time Fourier Transform (STFT)</w:t>
       </w:r>
     </w:p>
     <w:p>
@@ -5547,10 +5661,22 @@
       <w:r>
         <w:rPr>
           <w:rFonts w:ascii="Times New Roman" w:hAnsi="Times New Roman"/>
+          <w:sz w:val="24"/>
+        </w:rPr>
+        <w:t>Meskipun FFT sangat efisien, penerapan FFT standar secara langsung terhadap keseluruhan durasi berkas lagu rohani (misalnya sebuah lagu berdurasi 4 menit) tidak dapat digunakan untuk pengendalian pencahayaan panggung. Hal ini disebabkan oleh sifat fisik sinyal musik yang bersifat non-stasioner: komposisi lagu rohani memiliki struktur dinamika yang terus berubah terhadap waktu (terdiri dari bagian intro, verse, bridge, chorus, dan ending). Kandungan frekuensi, harmoni akord, kenyaringan, dan tempo musik berganti dari detik ke detik. FFT standar mengintegrasikan seluruh sinyal dari awal hingga akhir lagu, sehingga spektrum yang dihasilkan hanya memperlihatkan frekuensi apa saja yang muncul di sepanjang lagu, namun sama sekali tidak memiliki informasi mengenai kapan frekuensi tersebut terjadi. Tata cahaya panggung menuntut respons visual yang sinkron detik demi detik mengikuti dinamika lagu. Oleh karena itu, transformasi yang wajib digunakan untuk analisis musik adalah Short-Time Fourier Transform (STFT), yang membagi sinyal audio menjadi jendela-jendela waktu pendek (sliding frames) dan mengevaluasi FFT pada masing-masing jendela tersebut [21][33].</w:t>
+      </w:r>
+    </w:p>
+    <w:p>
+      <w:pPr>
+        <w:spacing w:line="360" w:lineRule="auto" w:after="120"/>
+      </w:pPr>
+      <w:r>
+        <w:rPr>
+          <w:rFonts w:ascii="Times New Roman" w:hAnsi="Times New Roman"/>
           <w:b/>
           <w:sz w:val="24"/>
         </w:rPr>
-        <w:t>d. Karakteristik Sinyal Musik Non-Stasioner dan Short-Time Fourier Transform (STFT)</w:t>
+        <w:t>e. Fungsi Windowing dan Mitigasi Spectral Leakage</w:t>
       </w:r>
     </w:p>
     <w:p>
@@ -5562,7 +5688,7 @@
           <w:rFonts w:ascii="Times New Roman" w:hAnsi="Times New Roman"/>
           <w:sz w:val="24"/>
         </w:rPr>
-        <w:t>Meskipun FFT sangat efisien, penerapan FFT standar secara langsung terhadap keseluruhan durasi berkas lagu rohani (misalnya sebuah lagu berdurasi 4 menit) tidak dapat digunakan untuk pengendalian pencahayaan panggung. Hal ini disebabkan oleh sifat fisik sinyal musik yang bersifat non-stasioner: komposisi lagu rohani memiliki struktur dinamika yang terus berubah terhadap waktu (terdiri dari bagian intro, verse, bridge, chorus, dan ending). Kandungan frekuensi, harmoni akord, kenyaringan, dan tempo musik berganti dari detik ke detik. FFT standar mengintegrasikan seluruh sinyal dari awal hingga akhir lagu, sehingga spektrum yang dihasilkan hanya memperlihatkan frekuensi apa saja yang muncul di sepanjang lagu, namun sama sekali tidak memiliki informasi mengenai kapan frekuensi tersebut terjadi. Tata cahaya panggung menuntut respons visual yang sinkron detik demi detik mengikuti dinamika lagu. Oleh karena itu, transformasi yang wajib digunakan untuk analisis musik adalah Short-Time Fourier Transform (STFT), yang membagi sinyal audio menjadi jendela-jendela waktu pendek (sliding frames) dan mengevaluasi FFT pada masing-masing jendela tersebut [21][33].</w:t>
+        <w:t>Dalam komputasi STFT, pemotongan sinyal audio menjadi segmen-segmen frame pendek secara matematis ekuivalen dengan mengalikan sinyal x[n] dengan suatu fungsi pembobotan (window function) w[n]. Jika frame dipotong menggunakan jendela persegi (Rectangular Window), pemotongan mendadak pada batas awal dan akhir frame menimbulkan diskontinuitas artifisial tajam pada sinyal. Di domain frekuensi, hal ini menimbulkan fenomena Spectral Leakage di mana energi frekuensi dari suatu nada murni bocor ke bin-bin frekuensi tetangga di sekitarnya dalam bentuk puncak sampingan (sidelobes) yang tinggi. Kebocoran spektral menyebabkan deteksi harmoni nada dan ekstraksi fitur Chroma menjadi bias akibat tercemar frekuensi palsu.</w:t>
       </w:r>
     </w:p>
     <w:p>
@@ -5572,31 +5698,6 @@
       <w:r>
         <w:rPr>
           <w:rFonts w:ascii="Times New Roman" w:hAnsi="Times New Roman"/>
-          <w:b/>
-          <w:sz w:val="24"/>
-        </w:rPr>
-        <w:t>e. Fungsi Windowing dan Mitigasi Spectral Leakage</w:t>
-      </w:r>
-    </w:p>
-    <w:p>
-      <w:pPr>
-        <w:spacing w:line="360" w:lineRule="auto" w:after="120"/>
-      </w:pPr>
-      <w:r>
-        <w:rPr>
-          <w:rFonts w:ascii="Times New Roman" w:hAnsi="Times New Roman"/>
-          <w:sz w:val="24"/>
-        </w:rPr>
-        <w:t>Dalam komputasi STFT, pemotongan sinyal audio menjadi segmen-segmen frame pendek secara matematis ekuivalen dengan mengalikan sinyal x[n] dengan suatu fungsi pembobotan (window function) w[n]. Jika frame dipotong menggunakan jendela persegi (Rectangular Window), pemotongan mendadak pada batas awal dan akhir frame menimbulkan diskontinuitas artifisial tajam pada sinyal. Di domain frekuensi, hal ini menimbulkan fenomena Spectral Leakage di mana energi frekuensi dari suatu nada murni bocor ke bin-bin frekuensi tetangga di sekitarnya dalam bentuk puncak sampingan (sidelobes) yang tinggi. Kebocoran spektral menyebabkan deteksi harmoni nada dan ekstraksi fitur Chroma menjadi bias akibat tercemar frekuensi palsu.</w:t>
-      </w:r>
-    </w:p>
-    <w:p>
-      <w:pPr>
-        <w:spacing w:line="360" w:lineRule="auto" w:after="120"/>
-      </w:pPr>
-      <w:r>
-        <w:rPr>
-          <w:rFonts w:ascii="Times New Roman" w:hAnsi="Times New Roman"/>
           <w:sz w:val="24"/>
         </w:rPr>
         <w:t>Untuk meredam spectral leakage, amplitudo sinyal pada tepi frame harus diturunkan secara mulus (tapering) menuju nol. Pada sistem ZZLUXORA, digunakan fungsi jendela Hann (Hanning) Window [21]:</w:t>
@@ -5605,15 +5706,22 @@
     <w:p>
       <w:pPr>
         <w:jc w:val="center"/>
-        <w:spacing w:line="360" w:lineRule="auto" w:after="120"/>
-      </w:pPr>
-      <w:r>
-        <w:rPr>
-          <w:rFonts w:ascii="Times New Roman" w:hAnsi="Times New Roman"/>
-          <w:i/>
-          <w:sz w:val="24"/>
-        </w:rPr>
-        <w:t>w[n] = 0.5 · [1 - cos(2πn / (N - 1))] = sin^2(πn / (N - 1)),  untuk 0 ≤ n ≤ N-1</w:t>
+        <w:spacing w:line="280" w:before="140" w:after="140"/>
+      </w:pPr>
+      <w:r>
+        <w:rPr>
+          <w:rFonts w:ascii="Cambria Math" w:hAnsi="Cambria Math"/>
+          <w:i/>
+          <w:sz w:val="24"/>
+        </w:rPr>
+        <w:t>w[n] = 0.5 · [1 - cos(2πn / (N - 1))] = sin^2(πn / (N - 1)),    0 ≤ n ≤ N-1</w:t>
+      </w:r>
+      <w:r>
+        <w:rPr>
+          <w:rFonts w:ascii="Times New Roman" w:hAnsi="Times New Roman"/>
+          <w:sz w:val="24"/>
+        </w:rPr>
+        <w:t>          (2.6)</w:t>
       </w:r>
     </w:p>
     <w:p>
@@ -5720,15 +5828,34 @@
     <w:p>
       <w:pPr>
         <w:jc w:val="center"/>
+        <w:spacing w:line="280" w:before="140" w:after="140"/>
+      </w:pPr>
+      <w:r>
+        <w:rPr>
+          <w:rFonts w:ascii="Cambria Math" w:hAnsi="Cambria Math"/>
+          <w:i/>
+          <w:sz w:val="24"/>
+        </w:rPr>
+        <w:t>X[m, k] = ∑_{n=0}^{N-1} x[n + m · H] · w[n] · e^{-j (2π/N) kn}</w:t>
+      </w:r>
+      <w:r>
+        <w:rPr>
+          <w:rFonts w:ascii="Times New Roman" w:hAnsi="Times New Roman"/>
+          <w:sz w:val="24"/>
+        </w:rPr>
+        <w:t>          (2.7)</w:t>
+      </w:r>
+    </w:p>
+    <w:p>
+      <w:pPr>
         <w:spacing w:line="360" w:lineRule="auto" w:after="120"/>
       </w:pPr>
       <w:r>
         <w:rPr>
           <w:rFonts w:ascii="Times New Roman" w:hAnsi="Times New Roman"/>
-          <w:i/>
-          <w:sz w:val="24"/>
-        </w:rPr>
-        <w:t>X[m, k] = ∑_{n=0}^{N-1} x[n + m · H] · w[n] · e^{-j (2π/N) kn}</w:t>
+          <w:sz w:val="24"/>
+        </w:rPr>
+        <w:t>di mana m adalah indeks frame waktu, k adalah indeks bin frekuensi, N = 2048 adalah panjang jendela analisis (Window Length), H = 512 adalah jarak pergeseran antar jendela (Hop Length dengan overlap 75%), w[n] adalah fungsi jendela Hann, dan x[n + m · H] adalah segmen sinyal audio pada jendela waktu ke-m. Hasil transformasi STFT adalah matriks bilangan kompleks X[m, k] berdimensi 1025 × M yang menghubungkan koordinat sel diskrit (m, k) dengan besaran fisik nyata:</w:t>
       </w:r>
     </w:p>
     <w:p>
@@ -5740,7 +5867,7 @@
           <w:rFonts w:ascii="Times New Roman" w:hAnsi="Times New Roman"/>
           <w:sz w:val="24"/>
         </w:rPr>
-        <w:t>di mana m adalah indeks frame waktu, k adalah indeks bin frekuensi, N = 2048 adalah panjang jendela analisis (Window Length), H = 512 adalah jarak pergeseran antar jendela (Hop Length dengan overlap 75%), w[n] adalah fungsi jendela Hann, dan x[n + m · H] adalah segmen sinyal audio pada jendela waktu ke-m. Hasil transformasi STFT adalah matriks bilangan kompleks X[m, k] berdimensi 1025 × M yang menghubungkan koordinat sel diskrit (m, k) dengan besaran fisik nyata:</w:t>
+        <w:t>1. Waktu Fisik frame ke-m: tm = (m · H) / fs (detik)</w:t>
       </w:r>
     </w:p>
     <w:p>
@@ -5752,7 +5879,7 @@
           <w:rFonts w:ascii="Times New Roman" w:hAnsi="Times New Roman"/>
           <w:sz w:val="24"/>
         </w:rPr>
-        <w:t>1. Waktu Fisik frame ke-m: tm = (m · H) / fs (detik)</w:t>
+        <w:t>2. Frekuensi Fisik bin ke-k: fk = (k · fs) / N (Hertz)</w:t>
       </w:r>
     </w:p>
     <w:p>
@@ -5764,7 +5891,7 @@
           <w:rFonts w:ascii="Times New Roman" w:hAnsi="Times New Roman"/>
           <w:sz w:val="24"/>
         </w:rPr>
-        <w:t>2. Frekuensi Fisik bin ke-k: fk = (k · fs) / N (Hertz)</w:t>
+        <w:t>3. Lebar Pita per Bin Frekuensi: Δf = fs / N = 22050 / 2048 ≈ 10,77 Hz</w:t>
       </w:r>
     </w:p>
     <w:p>
@@ -5776,7 +5903,7 @@
           <w:rFonts w:ascii="Times New Roman" w:hAnsi="Times New Roman"/>
           <w:sz w:val="24"/>
         </w:rPr>
-        <w:t>3. Lebar Pita per Bin Frekuensi: Δf = fs / N = 22050 / 2048 ≈ 10,77 Hz</w:t>
+        <w:t>4. Interval Perbaruan Waktu Frame: Δthop = H / fs = 512 / 22050 ≈ 23,22 ms</w:t>
       </w:r>
     </w:p>
     <w:p>
@@ -5788,7 +5915,7 @@
           <w:rFonts w:ascii="Times New Roman" w:hAnsi="Times New Roman"/>
           <w:sz w:val="24"/>
         </w:rPr>
-        <w:t>4. Interval Perbaruan Waktu Frame: Δthop = H / fs = 512 / 22050 ≈ 23,22 ms</w:t>
+        <w:t>Laju pembaruan data visual (frame rate) yang dihasilkan oleh algoritma adalah FPS = 1 / Δthop = 22050 / 512 ≈ 43,07 frame per detik (fps). Nilai 43,07 FPS ini secara presisi selaras dengan laju penyegaran transmisi fisik standar DMX512-A (44 frame per detik) [17], sehingga data pencahayaan dapat langsung dialirkan ke lampu PAR LED panggung tanpa membutuhkan interpolasi atau penahanan buffer tambahan, menghasilkan transisi visual yang sangat halus (smooth fading) dan bebas getaran (visual stepping).</w:t>
       </w:r>
     </w:p>
     <w:p>
@@ -5798,9 +5925,10 @@
       <w:r>
         <w:rPr>
           <w:rFonts w:ascii="Times New Roman" w:hAnsi="Times New Roman"/>
-          <w:sz w:val="24"/>
-        </w:rPr>
-        <w:t>Laju pembaruan data visual (frame rate) yang dihasilkan oleh algoritma adalah FPS = 1 / Δthop = 22050 / 512 ≈ 43,07 frame per detik (fps). Nilai 43,07 FPS ini secara presisi selaras dengan laju penyegaran transmisi fisik standar DMX512-A (44 frame per detik) [17], sehingga data pencahayaan dapat langsung dialirkan ke lampu PAR LED panggung tanpa membutuhkan interpolasi atau penahanan buffer tambahan, menghasilkan transisi visual yang sangat halus (smooth fading) dan bebas getaran (visual stepping).</w:t>
+          <w:b/>
+          <w:sz w:val="24"/>
+        </w:rPr>
+        <w:t>g. Prinsip Ketidakpastian Waktu-Frekuensi (Heisenberg-Gabor Limit)</w:t>
       </w:r>
     </w:p>
     <w:p>
@@ -5810,10 +5938,55 @@
       <w:r>
         <w:rPr>
           <w:rFonts w:ascii="Times New Roman" w:hAnsi="Times New Roman"/>
+          <w:sz w:val="24"/>
+        </w:rPr>
+        <w:t>Dalam pemrosesan sinyal waktu-frekuensi berlaku batasan fundamental fisika yang dikenal sebagai Prinsip Ketidakpastian Gabor:</w:t>
+      </w:r>
+    </w:p>
+    <w:p>
+      <w:pPr>
+        <w:jc w:val="center"/>
+        <w:spacing w:line="280" w:before="140" w:after="140"/>
+      </w:pPr>
+      <w:r>
+        <w:rPr>
+          <w:rFonts w:ascii="Cambria Math" w:hAnsi="Cambria Math"/>
+          <w:i/>
+          <w:sz w:val="24"/>
+        </w:rPr>
+        <w:t>Δt · Δf ≥ 1 / (4π)</w:t>
+      </w:r>
+      <w:r>
+        <w:rPr>
+          <w:rFonts w:ascii="Times New Roman" w:hAnsi="Times New Roman"/>
+          <w:sz w:val="24"/>
+        </w:rPr>
+        <w:t>          (2.8)</w:t>
+      </w:r>
+    </w:p>
+    <w:p>
+      <w:pPr>
+        <w:spacing w:line="360" w:lineRule="auto" w:after="120"/>
+      </w:pPr>
+      <w:r>
+        <w:rPr>
+          <w:rFonts w:ascii="Times New Roman" w:hAnsi="Times New Roman"/>
+          <w:sz w:val="24"/>
+        </w:rPr>
+        <w:t>Prinsip ini menegaskan bahwa kita tidak dapat memperoleh resolusi waktu yang sangat tinggi dan resolusi frekuensi yang sangat tinggi secara simultan menggunakan satu ukuran jendela STFT konstan. Jika N terlalu besar (misal 8192), resolusi frekuensi sangat tinggi namun resolusi waktu memburuk (Δt ≈ 371 ms), membuat ketukan drum buram dan terlambat. Sebaliknya jika N terlalu kecil (misal 256), resolusi waktu tajam namun resolusi frekuensi sangat kasar (Δf ≈ 86 Hz) sehingga nada musik tidak dapat dibedakan. Penetapan parameter fs = 22.050 Hz, N = 2048, dan H = 512 pada sistem ZZLUXORA merupakan titik kompromi optimal yang terbukti mampu membedakan harmoni akord musik (Δf ≈ 10,77 Hz) sekaligus mendeteksi ketukan musik dengan latensi rendah (Δthop ≈ 23,22 ms), berada jauh di bawah ambang batas persepsi keterlambatan visual mata manusia (&lt; 40 ms).</w:t>
+      </w:r>
+    </w:p>
+    <w:p>
+      <w:pPr>
+        <w:spacing w:line="360" w:lineRule="auto" w:after="120"/>
+      </w:pPr>
+      <w:r>
+        <w:rPr>
+          <w:rFonts w:ascii="Times New Roman" w:hAnsi="Times New Roman"/>
           <w:b/>
           <w:sz w:val="24"/>
         </w:rPr>
-        <w:t>g. Prinsip Ketidakpastian Waktu-Frekuensi (Heisenberg-Gabor Limit)</w:t>
+        <w:t>h. Penurunan Fitur Akustik Spektral Berbasis Spektrum STFT</w:t>
       </w:r>
     </w:p>
     <w:p>
@@ -5825,221 +5998,205 @@
           <w:rFonts w:ascii="Times New Roman" w:hAnsi="Times New Roman"/>
           <w:sz w:val="24"/>
         </w:rPr>
-        <w:t>Dalam pemrosesan sinyal waktu-frekuensi berlaku batasan fundamental fisika yang dikenal sebagai Prinsip Ketidakpastian Gabor: Δt · Δf ≥ 1 / (4π). Prinsip ini menegaskan bahwa kita tidak dapat memperoleh resolusi waktu yang sangat tinggi dan resolusi frekuensi yang sangat tinggi secara simultan menggunakan satu ukuran jendela STFT konstan. Jika N terlalu besar (misal 8192), resolusi frekuensi sangat tinggi namun resolusi waktu memburuk (Δt ≈ 371 ms), membuat ketukan drum buram dan terlambat. Sebaliknya jika N terlalu kecil (misal 256), resolusi waktu tajam namun resolusi frekuensi sangat kasar (Δf ≈ 86 Hz) sehingga nada musik tidak dapat dibedakan. Penetapan parameter fs = 22.050 Hz, N = 2048, dan H = 512 pada sistem ZZLUXORA merupakan titik kompromi optimal yang terbukti mampu membedakan harmoni akord musik (Δf ≈ 10,77 Hz) sekaligus mendeteksi ketukan musik dengan latensi rendah (Δthop ≈ 23,22 ms), berada jauh di bawah ambang batas persepsi keterlambatan visual mata manusia (&lt; 40 ms).</w:t>
-      </w:r>
-    </w:p>
-    <w:p>
-      <w:pPr>
-        <w:jc w:val="left"/>
-      </w:pPr>
-      <w:r>
-        <w:rPr>
-          <w:rFonts w:ascii="Times New Roman" w:hAnsi="Times New Roman"/>
-          <w:b/>
-          <w:sz w:val="24"/>
-        </w:rPr>
-        <w:t>b. Fitur Audio</w:t>
-      </w:r>
-    </w:p>
-    <w:p>
-      <w:pPr>
-        <w:ind w:firstLine="720"/>
-        <w:jc w:val="both"/>
-      </w:pPr>
-      <w:r>
-        <w:rPr>
-          <w:rFonts w:ascii="Times New Roman" w:hAnsi="Times New Roman"/>
-          <w:sz w:val="24"/>
-        </w:rPr>
-        <w:t>Berikut adalah fitur-fitur audio yang diekstraksi dalam penelitian ini:</w:t>
-      </w:r>
-    </w:p>
-    <w:p>
-      <w:pPr>
-        <w:ind w:left="720"/>
-        <w:jc w:val="both"/>
-      </w:pPr>
-      <w:r>
-        <w:rPr>
-          <w:rFonts w:ascii="Times New Roman" w:hAnsi="Times New Roman"/>
-          <w:i/>
-          <w:sz w:val="24"/>
-        </w:rPr>
-        <w:t xml:space="preserve">1. </w:t>
-      </w:r>
-      <w:r>
-        <w:rPr>
-          <w:rFonts w:ascii="Times New Roman" w:hAnsi="Times New Roman"/>
-          <w:i/>
-          <w:sz w:val="24"/>
-        </w:rPr>
-        <w:t>Tempo/BPM (</w:t>
-      </w:r>
-      <w:r>
-        <w:rPr>
-          <w:rFonts w:ascii="Times New Roman" w:hAnsi="Times New Roman"/>
-          <w:sz w:val="24"/>
-        </w:rPr>
-        <w:t>Beats Per Minute</w:t>
-      </w:r>
-      <w:r>
-        <w:rPr>
-          <w:rFonts w:ascii="Times New Roman" w:hAnsi="Times New Roman"/>
-          <w:i/>
-          <w:sz w:val="24"/>
-        </w:rPr>
-        <w:t>):</w:t>
-      </w:r>
-      <w:r>
-        <w:rPr>
-          <w:rFonts w:ascii="Times New Roman" w:hAnsi="Times New Roman"/>
-          <w:sz w:val="24"/>
-        </w:rPr>
-      </w:r>
-      <w:r>
-        <w:rPr>
-          <w:rFonts w:ascii="Times New Roman" w:hAnsi="Times New Roman"/>
-          <w:i/>
-          <w:sz w:val="24"/>
-        </w:rPr>
-        <w:t xml:space="preserve"> Kecepatan ketukan musik per menit. Lagu </w:t>
-      </w:r>
-      <w:r>
-        <w:rPr>
-          <w:rFonts w:ascii="Times New Roman" w:hAnsi="Times New Roman"/>
-          <w:sz w:val="24"/>
-        </w:rPr>
-        <w:t>praise</w:t>
-      </w:r>
-      <w:r>
-        <w:rPr>
-          <w:rFonts w:ascii="Times New Roman" w:hAnsi="Times New Roman"/>
-          <w:i/>
-          <w:sz w:val="24"/>
-        </w:rPr>
-        <w:t xml:space="preserve"> umumnya memiliki tempo tinggi (120–180 BPM), sedangkan lagu </w:t>
-      </w:r>
-      <w:r>
-        <w:rPr>
-          <w:rFonts w:ascii="Times New Roman" w:hAnsi="Times New Roman"/>
-          <w:sz w:val="24"/>
-        </w:rPr>
-        <w:t xml:space="preserve">worship* bertempo rendah (60–100 BPM) </w:t>
-      </w:r>
-      <w:r>
-        <w:rPr>
-          <w:rFonts w:ascii="Times New Roman" w:hAnsi="Times New Roman"/>
-          <w:sz w:val="24"/>
-        </w:rPr>
-        <w:t>[5]</w:t>
-      </w:r>
-      <w:r>
-        <w:rPr>
-          <w:rFonts w:ascii="Times New Roman" w:hAnsi="Times New Roman"/>
-          <w:sz w:val="24"/>
-        </w:rPr>
-        <w:t>.</w:t>
-      </w:r>
-    </w:p>
-    <w:p>
-      <w:pPr>
-        <w:ind w:left="720"/>
-        <w:jc w:val="both"/>
-      </w:pPr>
-      <w:r>
-        <w:rPr>
-          <w:rFonts w:ascii="Times New Roman" w:hAnsi="Times New Roman"/>
-          <w:i/>
-          <w:sz w:val="24"/>
-        </w:rPr>
-        <w:t xml:space="preserve">2. </w:t>
-      </w:r>
-      <w:r>
-        <w:rPr>
-          <w:rFonts w:ascii="Times New Roman" w:hAnsi="Times New Roman"/>
-          <w:i/>
-          <w:sz w:val="24"/>
-        </w:rPr>
-        <w:t>RMS Energy</w:t>
-      </w:r>
-      <w:r>
-        <w:rPr>
-          <w:rFonts w:ascii="Times New Roman" w:hAnsi="Times New Roman"/>
-          <w:sz w:val="24"/>
-        </w:rPr>
-        <w:t>:*</w:t>
-      </w:r>
-      <w:r>
-        <w:rPr>
-          <w:rFonts w:ascii="Times New Roman" w:hAnsi="Times New Roman"/>
-          <w:i/>
-          <w:sz w:val="24"/>
-        </w:rPr>
-        <w:t xml:space="preserve"> Akar kuadrat rata-rata (</w:t>
-      </w:r>
-      <w:r>
-        <w:rPr>
-          <w:rFonts w:ascii="Times New Roman" w:hAnsi="Times New Roman"/>
-          <w:sz w:val="24"/>
-        </w:rPr>
-        <w:t>Root Mean Square*) dari amplitudo sinyal, merepresentasikan kenyaringan atau energi keseluruhan lagu.</w:t>
+        <w:t>Berikut adalah rincian penurunan matematis fitur-fitur audio yang diekstraksi dari spektrum frekuensi STFT:</w:t>
+      </w:r>
+    </w:p>
+    <w:p>
+      <w:pPr>
+        <w:spacing w:line="360" w:lineRule="auto" w:after="120"/>
+      </w:pPr>
+      <w:r>
+        <w:rPr>
+          <w:rFonts w:ascii="Times New Roman" w:hAnsi="Times New Roman"/>
+          <w:sz w:val="24"/>
+        </w:rPr>
+        <w:t>1. Tempo dan Beat Tracking: Kecepatan ketukan musik per menit (BPM) dan penentuan posisi serangan ketukan untuk sinkronisasi transisi cue panggung. Lagu praise umumnya bertempo 120–160 BPM, sedangkan worship bertempo 60–85 BPM [5].</w:t>
+      </w:r>
+    </w:p>
+    <w:p>
+      <w:pPr>
+        <w:spacing w:line="360" w:lineRule="auto" w:after="120"/>
+      </w:pPr>
+      <w:r>
+        <w:rPr>
+          <w:rFonts w:ascii="Times New Roman" w:hAnsi="Times New Roman"/>
+          <w:sz w:val="24"/>
+        </w:rPr>
+        <w:t>2. RMS Energy: Representasi intensitas daya rata-rata per frame yang diturunkan melalui Teorema Parseval. Nilai ini dinormalisasi ke [0, 1] sebagai pengendali Master Dimmer lampu panggung:</w:t>
       </w:r>
     </w:p>
     <w:p>
       <w:pPr>
         <w:jc w:val="center"/>
+        <w:spacing w:line="280" w:before="140" w:after="140"/>
       </w:pPr>
       <w:r>
         <w:rPr>
           <w:rFonts w:ascii="Cambria Math" w:hAnsi="Cambria Math"/>
           <w:i/>
-          <w:sz w:val="22"/>
-        </w:rPr>
-        <w:t>RMS = \sqrt{\frac{1}{N} \sum_{i=1}^{N} x_i^2}</w:t>
-      </w:r>
-    </w:p>
-    <w:p>
-      <w:pPr>
-        <w:ind w:left="720"/>
-        <w:jc w:val="both"/>
-      </w:pPr>
-      <w:r>
-        <w:rPr>
-          <w:rFonts w:ascii="Times New Roman" w:hAnsi="Times New Roman"/>
-          <w:i/>
-          <w:sz w:val="24"/>
-        </w:rPr>
-        <w:t xml:space="preserve">3. </w:t>
-      </w:r>
-      <w:r>
-        <w:rPr>
-          <w:rFonts w:ascii="Times New Roman" w:hAnsi="Times New Roman"/>
-          <w:i/>
-          <w:sz w:val="24"/>
-        </w:rPr>
-        <w:t>Spectral Centroid</w:t>
-      </w:r>
-      <w:r>
-        <w:rPr>
-          <w:rFonts w:ascii="Times New Roman" w:hAnsi="Times New Roman"/>
-          <w:sz w:val="24"/>
-        </w:rPr>
-        <w:t>:*</w:t>
-      </w:r>
-      <w:r>
-        <w:rPr>
-          <w:rFonts w:ascii="Times New Roman" w:hAnsi="Times New Roman"/>
-          <w:i/>
-          <w:sz w:val="24"/>
-        </w:rPr>
-        <w:t xml:space="preserve"> Titik pusat massa spektrum frekuensi, merepresentasikan "kecerahan" (</w:t>
-      </w:r>
-      <w:r>
-        <w:rPr>
-          <w:rFonts w:ascii="Times New Roman" w:hAnsi="Times New Roman"/>
-          <w:sz w:val="24"/>
-        </w:rPr>
-        <w:t>brightness*) suara. Nilai tinggi menunjukkan dominasi frekuensi tinggi.</w:t>
+          <w:sz w:val="24"/>
+        </w:rPr>
+        <w:t>RMS[m] = √[ (1/N) · ∑_{n=0}^{N-1} |x[n + mH] · w[n]|^2 ]</w:t>
+      </w:r>
+      <w:r>
+        <w:rPr>
+          <w:rFonts w:ascii="Times New Roman" w:hAnsi="Times New Roman"/>
+          <w:sz w:val="24"/>
+        </w:rPr>
+        <w:t>          (2.9)</w:t>
+      </w:r>
+    </w:p>
+    <w:p>
+      <w:pPr>
+        <w:spacing w:line="360" w:lineRule="auto" w:after="120"/>
+      </w:pPr>
+      <w:r>
+        <w:rPr>
+          <w:rFonts w:ascii="Times New Roman" w:hAnsi="Times New Roman"/>
+          <w:sz w:val="24"/>
+        </w:rPr>
+        <w:t>3. Spectral Centroid: Titik pusat massa spektrum frekuensi pada frame ke-m yang mengindikasikan kecerahan timbre (timbre brightness) vokal dan instrumen:</w:t>
+      </w:r>
+    </w:p>
+    <w:p>
+      <w:pPr>
+        <w:jc w:val="center"/>
+        <w:spacing w:line="280" w:before="140" w:after="140"/>
+      </w:pPr>
+      <w:r>
+        <w:rPr>
+          <w:rFonts w:ascii="Cambria Math" w:hAnsi="Cambria Math"/>
+          <w:i/>
+          <w:sz w:val="24"/>
+        </w:rPr>
+        <w:t>Centroid[m] = [ ∑_{k=0}^{N/2} fk · |X[m, k]| ] / [ ∑_{k=0}^{N/2} |X[m, k]| ],    fk = (k · fs) / N</w:t>
+      </w:r>
+      <w:r>
+        <w:rPr>
+          <w:rFonts w:ascii="Times New Roman" w:hAnsi="Times New Roman"/>
+          <w:sz w:val="24"/>
+        </w:rPr>
+        <w:t>          (2.10)</w:t>
+      </w:r>
+    </w:p>
+    <w:p>
+      <w:pPr>
+        <w:spacing w:line="360" w:lineRule="auto" w:after="120"/>
+      </w:pPr>
+      <w:r>
+        <w:rPr>
+          <w:rFonts w:ascii="Times New Roman" w:hAnsi="Times New Roman"/>
+          <w:sz w:val="24"/>
+        </w:rPr>
+        <w:t>4. Chroma STFT (12-Semitone Pitch Class Profile): Proyeksi energi spektrum ke 12 nada kromatik (C, C#, D, ..., B) untuk mendeteksi akord Mayor (sukacita) vs Minor (khidmat):</w:t>
+      </w:r>
+    </w:p>
+    <w:p>
+      <w:pPr>
+        <w:jc w:val="center"/>
+        <w:spacing w:line="280" w:before="140" w:after="140"/>
+      </w:pPr>
+      <w:r>
+        <w:rPr>
+          <w:rFonts w:ascii="Cambria Math" w:hAnsi="Cambria Math"/>
+          <w:i/>
+          <w:sz w:val="24"/>
+        </w:rPr>
+        <w:t>p(f) = 12 · log2(f / 440) + 69,    c(k) = round(p(fk)) mod 12</w:t>
+      </w:r>
+      <w:r>
+        <w:rPr>
+          <w:rFonts w:ascii="Times New Roman" w:hAnsi="Times New Roman"/>
+          <w:sz w:val="24"/>
+        </w:rPr>
+        <w:t>          (2.11)</w:t>
+      </w:r>
+    </w:p>
+    <w:p>
+      <w:pPr>
+        <w:jc w:val="center"/>
+        <w:spacing w:line="280" w:before="140" w:after="140"/>
+      </w:pPr>
+      <w:r>
+        <w:rPr>
+          <w:rFonts w:ascii="Cambria Math" w:hAnsi="Cambria Math"/>
+          <w:i/>
+          <w:sz w:val="24"/>
+        </w:rPr>
+        <w:t>Chroma[m, c] = ∑_{k ∈ Kc} |X[m, k]|</w:t>
+      </w:r>
+      <w:r>
+        <w:rPr>
+          <w:rFonts w:ascii="Times New Roman" w:hAnsi="Times New Roman"/>
+          <w:sz w:val="24"/>
+        </w:rPr>
+        <w:t>          (2.12)</w:t>
+      </w:r>
+    </w:p>
+    <w:p>
+      <w:pPr>
+        <w:spacing w:line="360" w:lineRule="auto" w:after="120"/>
+      </w:pPr>
+      <w:r>
+        <w:rPr>
+          <w:rFonts w:ascii="Times New Roman" w:hAnsi="Times New Roman"/>
+          <w:sz w:val="24"/>
+        </w:rPr>
+        <w:t>5. Mel-Frequency Cepstral Coefficients (MFCC): 13 koefisien cepstral yang diekstraksi melalui 40 filterbank Mel segitiga dan Discrete Cosine Transform (DCT-II) untuk merepresentasikan tekstur instrumen akustik versus instrumen elektrik:</w:t>
+      </w:r>
+    </w:p>
+    <w:p>
+      <w:pPr>
+        <w:jc w:val="center"/>
+        <w:spacing w:line="280" w:before="140" w:after="140"/>
+      </w:pPr>
+      <w:r>
+        <w:rPr>
+          <w:rFonts w:ascii="Cambria Math" w:hAnsi="Cambria Math"/>
+          <w:i/>
+          <w:sz w:val="24"/>
+        </w:rPr>
+        <w:t>MFCC[m, l] = ∑_{b=1}^{40} log(S_Mel[m, b]) · cos[ πl(b - 0.5) / 40 ],    l = 0, 1, ..., 12</w:t>
+      </w:r>
+      <w:r>
+        <w:rPr>
+          <w:rFonts w:ascii="Times New Roman" w:hAnsi="Times New Roman"/>
+          <w:sz w:val="24"/>
+        </w:rPr>
+        <w:t>          (2.13)</w:t>
+      </w:r>
+    </w:p>
+    <w:p>
+      <w:pPr>
+        <w:spacing w:line="360" w:lineRule="auto" w:after="120"/>
+      </w:pPr>
+      <w:r>
+        <w:rPr>
+          <w:rFonts w:ascii="Times New Roman" w:hAnsi="Times New Roman"/>
+          <w:sz w:val="24"/>
+        </w:rPr>
+        <w:t>6. Onset Detection via Spectral Flux: Mengidentifikasi transien serangan nada dengan menghitung diferensial energi spektral positif:</w:t>
+      </w:r>
+    </w:p>
+    <w:p>
+      <w:pPr>
+        <w:jc w:val="center"/>
+        <w:spacing w:line="280" w:before="140" w:after="140"/>
+      </w:pPr>
+      <w:r>
+        <w:rPr>
+          <w:rFonts w:ascii="Cambria Math" w:hAnsi="Cambria Math"/>
+          <w:i/>
+          <w:sz w:val="24"/>
+        </w:rPr>
+        <w:t>SF[m] = ∑_{k=0}^{N/2} max(0, |X[m, k]| - |X[m-1, k]|)</w:t>
+      </w:r>
+      <w:r>
+        <w:rPr>
+          <w:rFonts w:ascii="Times New Roman" w:hAnsi="Times New Roman"/>
+          <w:sz w:val="24"/>
+        </w:rPr>
+        <w:t>          (2.14)</w:t>
       </w:r>
     </w:p>
     <w:tbl>
@@ -6080,7 +6237,7 @@
                 <w:b/>
                 <w:sz w:val="20"/>
               </w:rPr>
-              <w:t>^2}{\sum_{k=1}^{K}</w:t>
+              <w:t>^2}{∑_{k=1}^{K}</w:t>
             </w:r>
           </w:p>
         </w:tc>
@@ -6101,309 +6258,6 @@
         </w:tc>
       </w:tr>
     </w:tbl>
-    <w:p>
-      <w:pPr>
-        <w:ind w:firstLine="720"/>
-        <w:jc w:val="both"/>
-      </w:pPr>
-      <w:r>
-        <w:rPr>
-          <w:rFonts w:ascii="Times New Roman" w:hAnsi="Times New Roman"/>
-          <w:sz w:val="24"/>
-        </w:rPr>
-        <w:t xml:space="preserve">di mana $f(k)$ adalah frekuensi bin ke-$k$ dan $X(k)$ adalah magnitudo DFT pada bin ke-$k$ </w:t>
-      </w:r>
-      <w:r>
-        <w:rPr>
-          <w:rFonts w:ascii="Times New Roman" w:hAnsi="Times New Roman"/>
-          <w:sz w:val="24"/>
-        </w:rPr>
-        <w:t>[21]</w:t>
-      </w:r>
-      <w:r>
-        <w:rPr>
-          <w:rFonts w:ascii="Times New Roman" w:hAnsi="Times New Roman"/>
-          <w:sz w:val="24"/>
-        </w:rPr>
-        <w:t>.</w:t>
-      </w:r>
-    </w:p>
-    <w:p>
-      <w:pPr>
-        <w:ind w:left="720"/>
-        <w:jc w:val="both"/>
-      </w:pPr>
-      <w:r>
-        <w:rPr>
-          <w:rFonts w:ascii="Times New Roman" w:hAnsi="Times New Roman"/>
-          <w:i/>
-          <w:sz w:val="24"/>
-        </w:rPr>
-        <w:t xml:space="preserve">4. </w:t>
-      </w:r>
-      <w:r>
-        <w:rPr>
-          <w:rFonts w:ascii="Times New Roman" w:hAnsi="Times New Roman"/>
-          <w:i/>
-          <w:sz w:val="24"/>
-        </w:rPr>
-        <w:t>MFCC (</w:t>
-      </w:r>
-      <w:r>
-        <w:rPr>
-          <w:rFonts w:ascii="Times New Roman" w:hAnsi="Times New Roman"/>
-          <w:sz w:val="24"/>
-        </w:rPr>
-        <w:t>Mel-Frequency Cepstral Coefficients</w:t>
-      </w:r>
-      <w:r>
-        <w:rPr>
-          <w:rFonts w:ascii="Times New Roman" w:hAnsi="Times New Roman"/>
-          <w:i/>
-          <w:sz w:val="24"/>
-        </w:rPr>
-        <w:t>):</w:t>
-      </w:r>
-      <w:r>
-        <w:rPr>
-          <w:rFonts w:ascii="Times New Roman" w:hAnsi="Times New Roman"/>
-          <w:sz w:val="24"/>
-        </w:rPr>
-        <w:t xml:space="preserve">* Koefisien cepstral berbasis skala Mel yang merepresentasikan karakteristik timbre suara. Umumnya diambil 13 koefisien pertama </w:t>
-      </w:r>
-      <w:r>
-        <w:rPr>
-          <w:rFonts w:ascii="Times New Roman" w:hAnsi="Times New Roman"/>
-          <w:sz w:val="24"/>
-        </w:rPr>
-        <w:t>[1]</w:t>
-      </w:r>
-      <w:r>
-        <w:rPr>
-          <w:rFonts w:ascii="Times New Roman" w:hAnsi="Times New Roman"/>
-          <w:sz w:val="24"/>
-        </w:rPr>
-      </w:r>
-      <w:r>
-        <w:rPr>
-          <w:rFonts w:ascii="Times New Roman" w:hAnsi="Times New Roman"/>
-          <w:sz w:val="24"/>
-        </w:rPr>
-        <w:t>[2]</w:t>
-      </w:r>
-      <w:r>
-        <w:rPr>
-          <w:rFonts w:ascii="Times New Roman" w:hAnsi="Times New Roman"/>
-          <w:sz w:val="24"/>
-        </w:rPr>
-        <w:t>.</w:t>
-      </w:r>
-    </w:p>
-    <w:p>
-      <w:pPr>
-        <w:ind w:left="720"/>
-        <w:jc w:val="both"/>
-      </w:pPr>
-      <w:r>
-        <w:rPr>
-          <w:rFonts w:ascii="Times New Roman" w:hAnsi="Times New Roman"/>
-          <w:i/>
-          <w:sz w:val="24"/>
-        </w:rPr>
-        <w:t xml:space="preserve">5. </w:t>
-      </w:r>
-      <w:r>
-        <w:rPr>
-          <w:rFonts w:ascii="Times New Roman" w:hAnsi="Times New Roman"/>
-          <w:i/>
-          <w:sz w:val="24"/>
-        </w:rPr>
-        <w:t>Chroma Features</w:t>
-      </w:r>
-      <w:r>
-        <w:rPr>
-          <w:rFonts w:ascii="Times New Roman" w:hAnsi="Times New Roman"/>
-          <w:sz w:val="24"/>
-        </w:rPr>
-        <w:t>:** Representasi distribusi energi pada 12 kelas nada kromatik (C, C#, D, ..., B), merepresentasikan konten harmoni dan tonalitas lagu.</w:t>
-      </w:r>
-    </w:p>
-    <w:p>
-      <w:pPr>
-        <w:ind w:left="720"/>
-        <w:jc w:val="both"/>
-      </w:pPr>
-      <w:r>
-        <w:rPr>
-          <w:rFonts w:ascii="Times New Roman" w:hAnsi="Times New Roman"/>
-          <w:i/>
-          <w:sz w:val="24"/>
-        </w:rPr>
-        <w:t xml:space="preserve">6. </w:t>
-      </w:r>
-      <w:r>
-        <w:rPr>
-          <w:rFonts w:ascii="Times New Roman" w:hAnsi="Times New Roman"/>
-          <w:i/>
-          <w:sz w:val="24"/>
-        </w:rPr>
-        <w:t>Onset Detection</w:t>
-      </w:r>
-      <w:r>
-        <w:rPr>
-          <w:rFonts w:ascii="Times New Roman" w:hAnsi="Times New Roman"/>
-          <w:sz w:val="24"/>
-        </w:rPr>
-        <w:t>:*</w:t>
-      </w:r>
-      <w:r>
-        <w:rPr>
-          <w:rFonts w:ascii="Times New Roman" w:hAnsi="Times New Roman"/>
-          <w:i/>
-          <w:sz w:val="24"/>
-        </w:rPr>
-        <w:t xml:space="preserve"> Deteksi titik-titik awal setiap nada atau ketukan baru dalam sinyal audio. Dalam penelitian ini, </w:t>
-      </w:r>
-      <w:r>
-        <w:rPr>
-          <w:rFonts w:ascii="Times New Roman" w:hAnsi="Times New Roman"/>
-          <w:sz w:val="24"/>
-        </w:rPr>
-        <w:t>onset detection</w:t>
-      </w:r>
-      <w:r>
-        <w:rPr>
-          <w:rFonts w:ascii="Times New Roman" w:hAnsi="Times New Roman"/>
-          <w:i/>
-          <w:sz w:val="24"/>
-        </w:rPr>
-        <w:t xml:space="preserve"> digunakan untuk menentukan titik perubahan </w:t>
-      </w:r>
-      <w:r>
-        <w:rPr>
-          <w:rFonts w:ascii="Times New Roman" w:hAnsi="Times New Roman"/>
-          <w:sz w:val="24"/>
-        </w:rPr>
-        <w:t xml:space="preserve">scene* pencahayaan berdasarkan perubahan dinamika audio </w:t>
-      </w:r>
-      <w:r>
-        <w:rPr>
-          <w:rFonts w:ascii="Times New Roman" w:hAnsi="Times New Roman"/>
-          <w:sz w:val="24"/>
-        </w:rPr>
-        <w:t>[5]</w:t>
-      </w:r>
-      <w:r>
-        <w:rPr>
-          <w:rFonts w:ascii="Times New Roman" w:hAnsi="Times New Roman"/>
-          <w:sz w:val="24"/>
-        </w:rPr>
-        <w:t>.</w:t>
-      </w:r>
-    </w:p>
-    <w:p>
-      <w:pPr>
-        <w:ind w:left="720"/>
-        <w:jc w:val="both"/>
-      </w:pPr>
-      <w:r>
-        <w:rPr>
-          <w:rFonts w:ascii="Times New Roman" w:hAnsi="Times New Roman"/>
-          <w:i/>
-          <w:sz w:val="24"/>
-        </w:rPr>
-        <w:t xml:space="preserve">7. </w:t>
-      </w:r>
-      <w:r>
-        <w:rPr>
-          <w:rFonts w:ascii="Times New Roman" w:hAnsi="Times New Roman"/>
-          <w:i/>
-          <w:sz w:val="24"/>
-        </w:rPr>
-        <w:t>Beat Tracking</w:t>
-      </w:r>
-      <w:r>
-        <w:rPr>
-          <w:rFonts w:ascii="Times New Roman" w:hAnsi="Times New Roman"/>
-          <w:sz w:val="24"/>
-        </w:rPr>
-        <w:t>:*</w:t>
-      </w:r>
-      <w:r>
-        <w:rPr>
-          <w:rFonts w:ascii="Times New Roman" w:hAnsi="Times New Roman"/>
-          <w:i/>
-          <w:sz w:val="24"/>
-        </w:rPr>
-        <w:t xml:space="preserve"> Pelacakan posisi ketukan (</w:t>
-      </w:r>
-      <w:r>
-        <w:rPr>
-          <w:rFonts w:ascii="Times New Roman" w:hAnsi="Times New Roman"/>
-          <w:sz w:val="24"/>
-        </w:rPr>
-        <w:t>beat</w:t>
-      </w:r>
-      <w:r>
-        <w:rPr>
-          <w:rFonts w:ascii="Times New Roman" w:hAnsi="Times New Roman"/>
-          <w:i/>
-          <w:sz w:val="24"/>
-        </w:rPr>
-        <w:t xml:space="preserve">) dalam sinyal audio untuk sinkronisasi transisi pencahayaan dengan ritme musik. </w:t>
-      </w:r>
-      <w:r>
-        <w:rPr>
-          <w:rFonts w:ascii="Times New Roman" w:hAnsi="Times New Roman"/>
-          <w:sz w:val="24"/>
-        </w:rPr>
-        <w:t>Beat tracking</w:t>
-      </w:r>
-      <w:r>
-        <w:rPr>
-          <w:rFonts w:ascii="Times New Roman" w:hAnsi="Times New Roman"/>
-          <w:i/>
-          <w:sz w:val="24"/>
-        </w:rPr>
-        <w:t xml:space="preserve"> menjadi dasar utama penentuan waktu pergantian </w:t>
-      </w:r>
-      <w:r>
-        <w:rPr>
-          <w:rFonts w:ascii="Times New Roman" w:hAnsi="Times New Roman"/>
-          <w:sz w:val="24"/>
-        </w:rPr>
-        <w:t>scene</w:t>
-      </w:r>
-      <w:r>
-        <w:rPr>
-          <w:rFonts w:ascii="Times New Roman" w:hAnsi="Times New Roman"/>
-          <w:i/>
-          <w:sz w:val="24"/>
-        </w:rPr>
-        <w:t xml:space="preserve"> dan kecepatan </w:t>
-      </w:r>
-      <w:r>
-        <w:rPr>
-          <w:rFonts w:ascii="Times New Roman" w:hAnsi="Times New Roman"/>
-          <w:sz w:val="24"/>
-        </w:rPr>
-        <w:t xml:space="preserve">chase* </w:t>
-      </w:r>
-      <w:r>
-        <w:rPr>
-          <w:rFonts w:ascii="Times New Roman" w:hAnsi="Times New Roman"/>
-          <w:sz w:val="24"/>
-        </w:rPr>
-        <w:t>[5]</w:t>
-      </w:r>
-      <w:r>
-        <w:rPr>
-          <w:rFonts w:ascii="Times New Roman" w:hAnsi="Times New Roman"/>
-          <w:sz w:val="24"/>
-        </w:rPr>
-        <w:t>.</w:t>
-      </w:r>
-    </w:p>
     <w:p>
       <w:pPr>
         <w:spacing w:before="120" w:after="80"/>
@@ -7300,27 +7154,22 @@
     <w:p>
       <w:pPr>
         <w:jc w:val="center"/>
+        <w:spacing w:line="280" w:before="140" w:after="140"/>
       </w:pPr>
       <w:r>
         <w:rPr>
           <w:rFonts w:ascii="Cambria Math" w:hAnsi="Cambria Math"/>
           <w:i/>
-          <w:sz w:val="22"/>
-        </w:rPr>
-        <w:t>C = V \times S</w:t>
-      </w:r>
-    </w:p>
-    <w:p>
-      <w:pPr>
-        <w:jc w:val="center"/>
-      </w:pPr>
-      <w:r>
-        <w:rPr>
-          <w:rFonts w:ascii="Cambria Math" w:hAnsi="Cambria Math"/>
-          <w:i/>
-          <w:sz w:val="22"/>
-        </w:rPr>
-        <w:t>H' = \frac{H}{60°}</w:t>
+          <w:sz w:val="24"/>
+        </w:rPr>
+        <w:t>C = V · S,    H' = H / 60°,    X = C · (1 - |H' mod 2 - 1|),    m = V - C</w:t>
+      </w:r>
+      <w:r>
+        <w:rPr>
+          <w:rFonts w:ascii="Times New Roman" w:hAnsi="Times New Roman"/>
+          <w:sz w:val="24"/>
+        </w:rPr>
+        <w:t>          (2.15)</w:t>
       </w:r>
     </w:p>
     <w:tbl>
@@ -7352,19 +7201,6 @@
     </w:tbl>
     <w:p>
       <w:pPr>
-        <w:jc w:val="center"/>
-      </w:pPr>
-      <w:r>
-        <w:rPr>
-          <w:rFonts w:ascii="Cambria Math" w:hAnsi="Cambria Math"/>
-          <w:i/>
-          <w:sz w:val="22"/>
-        </w:rPr>
-        <w:t>m = V - C</w:t>
-      </w:r>
-    </w:p>
-    <w:p>
-      <w:pPr>
         <w:ind w:firstLine="720"/>
         <w:jc w:val="both"/>
       </w:pPr>
@@ -7379,14 +7215,22 @@
     <w:p>
       <w:pPr>
         <w:jc w:val="center"/>
+        <w:spacing w:line="280" w:before="140" w:after="140"/>
       </w:pPr>
       <w:r>
         <w:rPr>
           <w:rFonts w:ascii="Cambria Math" w:hAnsi="Cambria Math"/>
           <w:i/>
-          <w:sz w:val="22"/>
-        </w:rPr>
-        <w:t>(R_1, G_1, B_1) = \begin{cases} (C, X, 0) &amp; \text{jika } 0 \leq H' &lt; 1 \\ (X, C, 0) &amp; \text{jika } 1 \leq H' &lt; 2 \\ (0, C, X) &amp; \text{jika } 2 \leq H' &lt; 3 \\ (0, X, C) &amp; \text{jika } 3 \leq H' &lt; 4 \\ (X, 0, C) &amp; \text{jika } 4 \leq H' &lt; 5 \\ (C, 0, X) &amp; \text{jika } 5 \leq H' &lt; 6 \end{cases}</w:t>
+          <w:sz w:val="24"/>
+        </w:rPr>
+        <w:t>(R1, G1, B1) = (C, X, 0) saat H' &lt; 1, (X, C, 0) saat H' &lt; 2, (0, C, X) saat H' &lt; 3, (0, X, C) saat H' &lt; 4, (X, 0, C) saat H' &lt; 5, (C, 0, X) saat H' &lt; 6</w:t>
+      </w:r>
+      <w:r>
+        <w:rPr>
+          <w:rFonts w:ascii="Times New Roman" w:hAnsi="Times New Roman"/>
+          <w:sz w:val="24"/>
+        </w:rPr>
+        <w:t>          (2.16)</w:t>
       </w:r>
     </w:p>
     <w:p>
@@ -7405,14 +7249,22 @@
     <w:p>
       <w:pPr>
         <w:jc w:val="center"/>
+        <w:spacing w:line="280" w:before="140" w:after="140"/>
       </w:pPr>
       <w:r>
         <w:rPr>
           <w:rFonts w:ascii="Cambria Math" w:hAnsi="Cambria Math"/>
           <w:i/>
-          <w:sz w:val="22"/>
-        </w:rPr>
-        <w:t>R = (R_1 + m) \times 255, \quad G = (G_1 + m) \times 255, \quad B = (B_1 + m) \times 255</w:t>
+          <w:sz w:val="24"/>
+        </w:rPr>
+        <w:t>R = (R1 + m) · 255,    G = (G1 + m) · 255,    B = (B1 + m) · 255</w:t>
+      </w:r>
+      <w:r>
+        <w:rPr>
+          <w:rFonts w:ascii="Times New Roman" w:hAnsi="Times New Roman"/>
+          <w:sz w:val="24"/>
+        </w:rPr>
+        <w:t>          (2.17)</w:t>
       </w:r>
     </w:p>
     <w:p>
@@ -7474,27 +7326,22 @@
     <w:p>
       <w:pPr>
         <w:jc w:val="center"/>
+        <w:spacing w:line="280" w:before="140" w:after="140"/>
       </w:pPr>
       <w:r>
         <w:rPr>
           <w:rFonts w:ascii="Cambria Math" w:hAnsi="Cambria Math"/>
           <w:i/>
-          <w:sz w:val="22"/>
-        </w:rPr>
-        <w:t>W = \min(R, G, B)</w:t>
-      </w:r>
-    </w:p>
-    <w:p>
-      <w:pPr>
-        <w:jc w:val="center"/>
-      </w:pPr>
-      <w:r>
-        <w:rPr>
-          <w:rFonts w:ascii="Cambria Math" w:hAnsi="Cambria Math"/>
-          <w:i/>
-          <w:sz w:val="22"/>
-        </w:rPr>
-        <w:t>R' = R - W, \quad G' = G - W, \quad B' = B - W</w:t>
+          <w:sz w:val="24"/>
+        </w:rPr>
+        <w:t>W = min(R, G, B),    R' = R - W,    G' = G - W,    B' = B - W</w:t>
+      </w:r>
+      <w:r>
+        <w:rPr>
+          <w:rFonts w:ascii="Times New Roman" w:hAnsi="Times New Roman"/>
+          <w:sz w:val="24"/>
+        </w:rPr>
+        <w:t>          (2.18)</w:t>
       </w:r>
     </w:p>
     <w:p>
@@ -7632,14 +7479,22 @@
     <w:p>
       <w:pPr>
         <w:jc w:val="center"/>
+        <w:spacing w:line="280" w:before="140" w:after="140"/>
       </w:pPr>
       <w:r>
         <w:rPr>
           <w:rFonts w:ascii="Cambria Math" w:hAnsi="Cambria Math"/>
           <w:i/>
-          <w:sz w:val="22"/>
-        </w:rPr>
-        <w:t>x_{norm} = \frac{x - x_{min}}{x_{max} - x_{min}}</w:t>
+          <w:sz w:val="24"/>
+        </w:rPr>
+        <w:t>x_norm = (x - x_min) / (x_max - x_min)</w:t>
+      </w:r>
+      <w:r>
+        <w:rPr>
+          <w:rFonts w:ascii="Times New Roman" w:hAnsi="Times New Roman"/>
+          <w:sz w:val="24"/>
+        </w:rPr>
+        <w:t>          (2.19)</w:t>
       </w:r>
     </w:p>
     <w:p>
@@ -9357,1012 +9212,6 @@
     </w:p>
     <w:p>
       <w:pPr>
-        <w:ind w:left="567"/>
-      </w:pPr>
-      <w:r>
-        <w:rPr>
-          <w:rFonts w:ascii="Courier New" w:hAnsi="Courier New"/>
-          <w:sz w:val="18"/>
-        </w:rPr>
-        <w:t>┌─────────────────┐</w:t>
-        <w:br/>
-        <w:t>│   Audio Input   │  File audio lagu rohani (.mp3/.wav)</w:t>
-        <w:br/>
-        <w:t>│   (.mp3/.wav)   │</w:t>
-        <w:br/>
-        <w:t>└────────┬────────┘</w:t>
-        <w:br/>
-        <w:t xml:space="preserve">         │</w:t>
-        <w:br/>
-        <w:t xml:space="preserve">         ▼</w:t>
-        <w:br/>
-        <w:t>┌─────────────────┐</w:t>
-        <w:br/>
-        <w:t>│   Ekstraksi     │  BPM, RMS, Spectral Centroid, MFCC,</w:t>
-        <w:br/>
-        <w:t>│   Fitur Audio   │  Chroma, Onset Detection, Beat Tracking</w:t>
-        <w:br/>
-        <w:t>│   (librosa)     │</w:t>
-        <w:br/>
-        <w:t>└────────┬────────┘</w:t>
-        <w:br/>
-        <w:t xml:space="preserve">         │</w:t>
-        <w:br/>
-        <w:t xml:space="preserve">         ▼</w:t>
-        <w:br/>
-        <w:t>┌─────────────────┐</w:t>
-        <w:br/>
-        <w:t>│   Normalisasi   │  Min-Max Scaling [0, 1]</w:t>
-        <w:br/>
-        <w:t>│   Fitur         │</w:t>
-        <w:br/>
-        <w:t>└────────┬────────┘</w:t>
-        <w:br/>
-        <w:t xml:space="preserve">         │</w:t>
-        <w:br/>
-        <w:t xml:space="preserve">         ▼</w:t>
-        <w:br/>
-        <w:t>┌─────────────────┐</w:t>
-        <w:br/>
-        <w:t>│   Perhitungan   │  Rule-based weighted sum</w:t>
-        <w:br/>
-        <w:t>│   Valence &amp;     │  berdasarkan fitur audio</w:t>
-        <w:br/>
-        <w:t>│   Arousal       │</w:t>
-        <w:br/>
-        <w:t>└────────┬────────┘</w:t>
-        <w:br/>
-        <w:t xml:space="preserve">         │</w:t>
-        <w:br/>
-        <w:t xml:space="preserve">         ▼</w:t>
-        <w:br/>
-        <w:t>┌─────────────────┐</w:t>
-        <w:br/>
-        <w:t>│   Pemetaan      │  V-A → H (jenis warna)</w:t>
-        <w:br/>
-        <w:t>│   V-A → HSV     │  V-A → S (kejenuhan)</w:t>
-        <w:br/>
-        <w:t>│   (Rule-Based)  │  V-A → V (kecerahan)</w:t>
-        <w:br/>
-        <w:t>└────────┬────────┘</w:t>
-        <w:br/>
-        <w:t xml:space="preserve">         │</w:t>
-        <w:br/>
-        <w:t xml:space="preserve">         ▼</w:t>
-        <w:br/>
-        <w:t>┌─────────────────┐</w:t>
-        <w:br/>
-        <w:t>│   Konversi      │  Algoritma standar Foley &amp; van Dam</w:t>
-        <w:br/>
-        <w:t>│   HSV → RGB     │</w:t>
-        <w:br/>
-        <w:t>└────────┬────────┘</w:t>
-        <w:br/>
-        <w:t xml:space="preserve">         │</w:t>
-        <w:br/>
-        <w:t xml:space="preserve">         ▼</w:t>
-        <w:br/>
-        <w:t>┌─────────────────┐</w:t>
-        <w:br/>
-        <w:t>│   Ekstraksi     │  W = min(R,G,B)</w:t>
-        <w:br/>
-        <w:t>│   White Channel │  R'=R-W, G'=G-W, B'=B-W</w:t>
-        <w:br/>
-        <w:t>│   RGB → RGBW    │</w:t>
-        <w:br/>
-        <w:t>└────────┬────────┘</w:t>
-        <w:br/>
-        <w:t xml:space="preserve">         │</w:t>
-        <w:br/>
-        <w:t xml:space="preserve">         ▼</w:t>
-        <w:br/>
-        <w:t>┌─────────────────┐</w:t>
-        <w:br/>
-        <w:t>│   Pembangkitan  │  Berdasarkan beat tracking &amp;</w:t>
-        <w:br/>
-        <w:t>│   Scene &amp; Chase │  onset detection</w:t>
-        <w:br/>
-        <w:t>│   (DRGBW)       │  + rules BPM/RMS → timing transisi</w:t>
-        <w:br/>
-        <w:t>└────────┬────────┘</w:t>
-        <w:br/>
-        <w:t xml:space="preserve">         │</w:t>
-        <w:br/>
-        <w:t xml:space="preserve">         ▼</w:t>
-        <w:br/>
-        <w:t>┌─────────────────┐</w:t>
-        <w:br/>
-        <w:t>│   Pengiriman    │  UDP port 6454</w:t>
-        <w:br/>
-        <w:t>│   Art-Net       │  Universe 0, 512 channel</w:t>
-        <w:br/>
-        <w:t>└────────┬────────┘</w:t>
-        <w:br/>
-        <w:t xml:space="preserve">         │</w:t>
-        <w:br/>
-        <w:t xml:space="preserve">    ┌────┴────┐</w:t>
-        <w:br/>
-        <w:t xml:space="preserve">    │         │</w:t>
-        <w:br/>
-        <w:t xml:space="preserve">    ▼         ▼</w:t>
-        <w:br/>
-        <w:t>┌────────┐ ┌────────┐</w:t>
-        <w:br/>
-        <w:t>│Virtual │ │ WiFi/  │</w:t>
-        <w:br/>
-        <w:t>│Adapter │ │Hotspot │</w:t>
-        <w:br/>
-        <w:t>│→ QLC+  │ │→ ESP32 │</w:t>
-        <w:br/>
-        <w:t>└───┬────┘ └───┬────┘</w:t>
-        <w:br/>
-        <w:t xml:space="preserve">    │          │</w:t>
-        <w:br/>
-        <w:t xml:space="preserve">    ▼          ▼</w:t>
-        <w:br/>
-        <w:t>┌────────┐ ┌────────┐</w:t>
-        <w:br/>
-        <w:t>│Art-Net │ │MAX485  │</w:t>
-        <w:br/>
-        <w:t>│→ ESP32 │ │→ DMX   │</w:t>
-        <w:br/>
-        <w:t>└───┬────┘ └───┬────┘</w:t>
-        <w:br/>
-        <w:t xml:space="preserve">    │          │</w:t>
-        <w:br/>
-        <w:t xml:space="preserve">    └────┬─────┘</w:t>
-        <w:br/>
-        <w:t xml:space="preserve">         │</w:t>
-        <w:br/>
-        <w:t xml:space="preserve">         ▼</w:t>
-        <w:br/>
-        <w:t>┌─────────────────┐</w:t>
-        <w:br/>
-        <w:t>│   PAR LED RGBW  │  4 unit (pengujian)</w:t>
-        <w:br/>
-        <w:t>│   via DMX512    │  8 channel per fixture</w:t>
-        <w:br/>
-        <w:t>└─────────────────┘</w:t>
-      </w:r>
-    </w:p>
-    <w:p>
-      <w:pPr>
-        <w:ind w:firstLine="720"/>
-        <w:jc w:val="both"/>
-      </w:pPr>
-      <w:r>
-        <w:rPr>
-          <w:rFonts w:ascii="Times New Roman" w:hAnsi="Times New Roman"/>
-          <w:sz w:val="24"/>
-        </w:rPr>
-        <w:t>Berdasarkan kerangka berpikir di atas, sistem yang dibangun menghubungkan domain audio (</w:t>
-      </w:r>
-      <w:r>
-        <w:rPr>
-          <w:rFonts w:ascii="Times New Roman" w:hAnsi="Times New Roman"/>
-          <w:i/>
-          <w:sz w:val="24"/>
-        </w:rPr>
-        <w:t>input</w:t>
-      </w:r>
-      <w:r>
-        <w:rPr>
-          <w:rFonts w:ascii="Times New Roman" w:hAnsi="Times New Roman"/>
-          <w:sz w:val="24"/>
-        </w:rPr>
-        <w:t>) dengan domain visual (</w:t>
-      </w:r>
-      <w:r>
-        <w:rPr>
-          <w:rFonts w:ascii="Times New Roman" w:hAnsi="Times New Roman"/>
-          <w:i/>
-          <w:sz w:val="24"/>
-        </w:rPr>
-        <w:t>output</w:t>
-      </w:r>
-      <w:r>
-        <w:rPr>
-          <w:rFonts w:ascii="Times New Roman" w:hAnsi="Times New Roman"/>
-          <w:sz w:val="24"/>
-        </w:rPr>
-        <w:t>) melalui serangkaian transformasi matematis yang dapat diuji dan diverifikasi secara objektif. Penilaian akhir kesesuaian dilakukan melalui dua pendekatan: (1) uji objektif berupa konsistensi dan determinisme pemetaan serta korelasi statistik antara fitur audio dan nilai RGBW, dan (2) uji subjektif berupa persepsi pengguna terhadap kesesuaian pencahayaan dengan karakteristik lagu.</w:t>
-      </w:r>
-    </w:p>
-    <w:p>
-      <w:pPr>
-        <w:spacing w:before="240" w:after="120"/>
-        <w:jc w:val="left"/>
-      </w:pPr>
-      <w:r>
-        <w:rPr>
-          <w:rFonts w:ascii="Times New Roman" w:hAnsi="Times New Roman"/>
-          <w:b/>
-          <w:sz w:val="24"/>
-        </w:rPr>
-        <w:t>2.4 Hipotesis Teoritis</w:t>
-      </w:r>
-    </w:p>
-    <w:p>
-      <w:pPr>
-        <w:ind w:firstLine="720"/>
-        <w:jc w:val="both"/>
-      </w:pPr>
-      <w:r>
-        <w:rPr>
-          <w:rFonts w:ascii="Times New Roman" w:hAnsi="Times New Roman"/>
-          <w:sz w:val="24"/>
-        </w:rPr>
-        <w:t>Berdasarkan kajian pustaka dan kerangka berpikir yang telah diuraikan, hipotesis teoritis dalam penelitian ini adalah sebagai berikut:</w:t>
-      </w:r>
-    </w:p>
-    <w:p>
-      <w:pPr>
-        <w:ind w:left="720"/>
-        <w:jc w:val="both"/>
-      </w:pPr>
-      <w:r>
-        <w:rPr>
-          <w:rFonts w:ascii="Times New Roman" w:hAnsi="Times New Roman"/>
-          <w:sz w:val="24"/>
-        </w:rPr>
-        <w:t xml:space="preserve">1. Fitur-fitur audio lagu rohani (BPM, </w:t>
-      </w:r>
-      <w:r>
-        <w:rPr>
-          <w:rFonts w:ascii="Times New Roman" w:hAnsi="Times New Roman"/>
-          <w:i/>
-          <w:sz w:val="24"/>
-        </w:rPr>
-        <w:t>RMS energy</w:t>
-      </w:r>
-      <w:r>
-        <w:rPr>
-          <w:rFonts w:ascii="Times New Roman" w:hAnsi="Times New Roman"/>
-          <w:sz w:val="24"/>
-        </w:rPr>
-        <w:t xml:space="preserve">, </w:t>
-      </w:r>
-      <w:r>
-        <w:rPr>
-          <w:rFonts w:ascii="Times New Roman" w:hAnsi="Times New Roman"/>
-          <w:i/>
-          <w:sz w:val="24"/>
-        </w:rPr>
-        <w:t>spectral centroid</w:t>
-      </w:r>
-      <w:r>
-        <w:rPr>
-          <w:rFonts w:ascii="Times New Roman" w:hAnsi="Times New Roman"/>
-          <w:sz w:val="24"/>
-        </w:rPr>
-        <w:t xml:space="preserve">, </w:t>
-      </w:r>
-      <w:r>
-        <w:rPr>
-          <w:rFonts w:ascii="Times New Roman" w:hAnsi="Times New Roman"/>
-          <w:i/>
-          <w:sz w:val="24"/>
-        </w:rPr>
-        <w:t>chroma features</w:t>
-      </w:r>
-      <w:r>
-        <w:rPr>
-          <w:rFonts w:ascii="Times New Roman" w:hAnsi="Times New Roman"/>
-          <w:sz w:val="24"/>
-        </w:rPr>
-        <w:t xml:space="preserve">) dapat dipetakan secara sistematis ke parameter pencahayaan RGBW melalui model matematis </w:t>
-      </w:r>
-      <w:r>
-        <w:rPr>
-          <w:rFonts w:ascii="Times New Roman" w:hAnsi="Times New Roman"/>
-          <w:i/>
-          <w:sz w:val="24"/>
-        </w:rPr>
-        <w:t>rule-based</w:t>
-      </w:r>
-      <w:r>
-        <w:rPr>
-          <w:rFonts w:ascii="Times New Roman" w:hAnsi="Times New Roman"/>
-          <w:sz w:val="24"/>
-        </w:rPr>
-        <w:t xml:space="preserve"> berbasis ruang warna HSV, dengan dasar referensi korelasi musik-warna dari Palmer </w:t>
-      </w:r>
-      <w:r>
-        <w:rPr>
-          <w:rFonts w:ascii="Times New Roman" w:hAnsi="Times New Roman"/>
-          <w:i/>
-          <w:sz w:val="24"/>
-        </w:rPr>
-        <w:t>et al.</w:t>
-      </w:r>
-      <w:r>
-        <w:rPr>
-          <w:rFonts w:ascii="Times New Roman" w:hAnsi="Times New Roman"/>
-          <w:sz w:val="24"/>
-        </w:rPr>
-        <w:t xml:space="preserve"> (2013) dan Lindborg (2021).</w:t>
-      </w:r>
-    </w:p>
-    <w:p>
-      <w:pPr>
-        <w:ind w:left="720"/>
-        <w:jc w:val="both"/>
-      </w:pPr>
-      <w:r>
-        <w:rPr>
-          <w:rFonts w:ascii="Times New Roman" w:hAnsi="Times New Roman"/>
-          <w:sz w:val="24"/>
-        </w:rPr>
-        <w:t xml:space="preserve">2. Sistem </w:t>
-      </w:r>
-      <w:r>
-        <w:rPr>
-          <w:rFonts w:ascii="Times New Roman" w:hAnsi="Times New Roman"/>
-          <w:i/>
-          <w:sz w:val="24"/>
-        </w:rPr>
-        <w:t>audio-reactive lighting</w:t>
-      </w:r>
-      <w:r>
-        <w:rPr>
-          <w:rFonts w:ascii="Times New Roman" w:hAnsi="Times New Roman"/>
-          <w:sz w:val="24"/>
-        </w:rPr>
-        <w:t xml:space="preserve"> yang dibangun mampu menghasilkan </w:t>
-      </w:r>
-      <w:r>
-        <w:rPr>
-          <w:rFonts w:ascii="Times New Roman" w:hAnsi="Times New Roman"/>
-          <w:i/>
-          <w:sz w:val="24"/>
-        </w:rPr>
-        <w:t>scene</w:t>
-      </w:r>
-      <w:r>
-        <w:rPr>
-          <w:rFonts w:ascii="Times New Roman" w:hAnsi="Times New Roman"/>
-          <w:sz w:val="24"/>
-        </w:rPr>
-        <w:t xml:space="preserve"> dan </w:t>
-      </w:r>
-      <w:r>
-        <w:rPr>
-          <w:rFonts w:ascii="Times New Roman" w:hAnsi="Times New Roman"/>
-          <w:i/>
-          <w:sz w:val="24"/>
-        </w:rPr>
-        <w:t>chase</w:t>
-      </w:r>
-      <w:r>
-        <w:rPr>
-          <w:rFonts w:ascii="Times New Roman" w:hAnsi="Times New Roman"/>
-          <w:sz w:val="24"/>
-        </w:rPr>
-        <w:t xml:space="preserve"> pencahayaan yang dipersepsikan sesuai dengan karakteristik audio lagu rohani oleh pengguna.</w:t>
-      </w:r>
-    </w:p>
-    <w:p>
-      <w:pPr>
-        <w:ind w:left="720"/>
-        <w:jc w:val="both"/>
-      </w:pPr>
-      <w:r>
-        <w:rPr>
-          <w:rFonts w:ascii="Times New Roman" w:hAnsi="Times New Roman"/>
-          <w:sz w:val="24"/>
-        </w:rPr>
-        <w:t xml:space="preserve">3. Integrasi protokol </w:t>
-      </w:r>
-      <w:r>
-        <w:rPr>
-          <w:rFonts w:ascii="Times New Roman" w:hAnsi="Times New Roman"/>
-          <w:i/>
-          <w:sz w:val="24"/>
-        </w:rPr>
-        <w:t>Art-Net</w:t>
-      </w:r>
-      <w:r>
-        <w:rPr>
-          <w:rFonts w:ascii="Times New Roman" w:hAnsi="Times New Roman"/>
-          <w:sz w:val="24"/>
-        </w:rPr>
-        <w:t xml:space="preserve"> DMX512 melalui jaringan nirkabel (WiFi/</w:t>
-      </w:r>
-      <w:r>
-        <w:rPr>
-          <w:rFonts w:ascii="Times New Roman" w:hAnsi="Times New Roman"/>
-          <w:i/>
-          <w:sz w:val="24"/>
-        </w:rPr>
-        <w:t>hotspot</w:t>
-      </w:r>
-      <w:r>
-        <w:rPr>
-          <w:rFonts w:ascii="Times New Roman" w:hAnsi="Times New Roman"/>
-          <w:sz w:val="24"/>
-        </w:rPr>
-        <w:t xml:space="preserve">) ke modul ESP32 mampu mengendalikan lampu PAR LED RGBW dengan </w:t>
-      </w:r>
-      <w:r>
-        <w:rPr>
-          <w:rFonts w:ascii="Times New Roman" w:hAnsi="Times New Roman"/>
-          <w:i/>
-          <w:sz w:val="24"/>
-        </w:rPr>
-        <w:t>latency</w:t>
-      </w:r>
-      <w:r>
-        <w:rPr>
-          <w:rFonts w:ascii="Times New Roman" w:hAnsi="Times New Roman"/>
-          <w:sz w:val="24"/>
-        </w:rPr>
-        <w:t xml:space="preserve"> yang dapat diterima untuk penggunaan ibadah secara </w:t>
-      </w:r>
-      <w:r>
-        <w:rPr>
-          <w:rFonts w:ascii="Times New Roman" w:hAnsi="Times New Roman"/>
-          <w:i/>
-          <w:sz w:val="24"/>
-        </w:rPr>
-        <w:t>real-time</w:t>
-      </w:r>
-      <w:r>
-        <w:rPr>
-          <w:rFonts w:ascii="Times New Roman" w:hAnsi="Times New Roman"/>
-          <w:sz w:val="24"/>
-        </w:rPr>
-        <w:t>.</w:t>
-      </w:r>
-    </w:p>
-    <w:p>
-      <w:r>
-        <w:br w:type="page"/>
-      </w:r>
-    </w:p>
-    <w:p>
-      <w:pPr>
-        <w:spacing w:before="240" w:after="240"/>
-        <w:jc w:val="center"/>
-      </w:pPr>
-      <w:r>
-        <w:rPr>
-          <w:rFonts w:ascii="Times New Roman" w:hAnsi="Times New Roman"/>
-          <w:b/>
-          <w:sz w:val="28"/>
-        </w:rPr>
-        <w:t>BAB 3 METODE PENELITIAN</w:t>
-      </w:r>
-    </w:p>
-    <w:p>
-      <w:pPr>
-        <w:spacing w:before="240" w:after="120"/>
-        <w:jc w:val="left"/>
-      </w:pPr>
-      <w:r>
-        <w:rPr>
-          <w:rFonts w:ascii="Times New Roman" w:hAnsi="Times New Roman"/>
-          <w:b/>
-          <w:sz w:val="24"/>
-        </w:rPr>
-        <w:t>3.1 Pendekatan, Jenis, dan Prosedur Penelitian</w:t>
-      </w:r>
-    </w:p>
-    <w:p>
-      <w:pPr>
-        <w:spacing w:before="120" w:after="80"/>
-        <w:jc w:val="left"/>
-      </w:pPr>
-      <w:r>
-        <w:rPr>
-          <w:rFonts w:ascii="Times New Roman" w:hAnsi="Times New Roman"/>
-          <w:b/>
-          <w:sz w:val="24"/>
-        </w:rPr>
-        <w:t>3.1.1 Pendekatan Penelitian</w:t>
-      </w:r>
-    </w:p>
-    <w:p>
-      <w:pPr>
-        <w:ind w:firstLine="720"/>
-        <w:jc w:val="both"/>
-      </w:pPr>
-      <w:r>
-        <w:rPr>
-          <w:rFonts w:ascii="Times New Roman" w:hAnsi="Times New Roman"/>
-          <w:sz w:val="24"/>
-        </w:rPr>
-        <w:t xml:space="preserve">Penelitian ini menggunakan pendekatan kuantitatif, yaitu pendekatan yang menekankan pada pengumpulan dan analisis data berupa angka-angka untuk menguji hipotesis dan mengukur variabel penelitian secara objektif. Data kuantitatif yang dikumpulkan meliputi nilai-nilai fitur audio (BPM, </w:t>
-      </w:r>
-      <w:r>
-        <w:rPr>
-          <w:rFonts w:ascii="Times New Roman" w:hAnsi="Times New Roman"/>
-          <w:i/>
-          <w:sz w:val="24"/>
-        </w:rPr>
-        <w:t>RMS</w:t>
-      </w:r>
-      <w:r>
-        <w:rPr>
-          <w:rFonts w:ascii="Times New Roman" w:hAnsi="Times New Roman"/>
-          <w:sz w:val="24"/>
-        </w:rPr>
-        <w:t xml:space="preserve">, </w:t>
-      </w:r>
-      <w:r>
-        <w:rPr>
-          <w:rFonts w:ascii="Times New Roman" w:hAnsi="Times New Roman"/>
-          <w:i/>
-          <w:sz w:val="24"/>
-        </w:rPr>
-        <w:t>spectral centroid</w:t>
-      </w:r>
-      <w:r>
-        <w:rPr>
-          <w:rFonts w:ascii="Times New Roman" w:hAnsi="Times New Roman"/>
-          <w:sz w:val="24"/>
-        </w:rPr>
-        <w:t xml:space="preserve">), nilai </w:t>
-      </w:r>
-      <w:r>
-        <w:rPr>
-          <w:rFonts w:ascii="Times New Roman" w:hAnsi="Times New Roman"/>
-          <w:i/>
-          <w:sz w:val="24"/>
-        </w:rPr>
-        <w:t>output</w:t>
-      </w:r>
-      <w:r>
-        <w:rPr>
-          <w:rFonts w:ascii="Times New Roman" w:hAnsi="Times New Roman"/>
-          <w:sz w:val="24"/>
-        </w:rPr>
-        <w:t xml:space="preserve"> RGBW, waktu </w:t>
-      </w:r>
-      <w:r>
-        <w:rPr>
-          <w:rFonts w:ascii="Times New Roman" w:hAnsi="Times New Roman"/>
-          <w:i/>
-          <w:sz w:val="24"/>
-        </w:rPr>
-        <w:t>latency</w:t>
-      </w:r>
-      <w:r>
-        <w:rPr>
-          <w:rFonts w:ascii="Times New Roman" w:hAnsi="Times New Roman"/>
-          <w:sz w:val="24"/>
-        </w:rPr>
-        <w:t xml:space="preserve">, skor </w:t>
-      </w:r>
-      <w:r>
-        <w:rPr>
-          <w:rFonts w:ascii="Times New Roman" w:hAnsi="Times New Roman"/>
-          <w:i/>
-          <w:sz w:val="24"/>
-        </w:rPr>
-        <w:t>usability</w:t>
-      </w:r>
-      <w:r>
-        <w:rPr>
-          <w:rFonts w:ascii="Times New Roman" w:hAnsi="Times New Roman"/>
-          <w:sz w:val="24"/>
-        </w:rPr>
-        <w:t xml:space="preserve"> (SUS), dan skor kesesuaian pencahayaan.</w:t>
-      </w:r>
-    </w:p>
-    <w:p>
-      <w:pPr>
-        <w:spacing w:before="120" w:after="80"/>
-        <w:jc w:val="left"/>
-      </w:pPr>
-      <w:r>
-        <w:rPr>
-          <w:rFonts w:ascii="Times New Roman" w:hAnsi="Times New Roman"/>
-          <w:b/>
-          <w:sz w:val="24"/>
-        </w:rPr>
-        <w:t>3.1.2 Jenis Penelitian</w:t>
-      </w:r>
-    </w:p>
-    <w:p>
-      <w:pPr>
-        <w:ind w:firstLine="720"/>
-        <w:jc w:val="both"/>
-      </w:pPr>
-      <w:r>
-        <w:rPr>
-          <w:rFonts w:ascii="Times New Roman" w:hAnsi="Times New Roman"/>
-          <w:sz w:val="24"/>
-        </w:rPr>
-        <w:t xml:space="preserve">Jenis penelitian ini adalah </w:t>
-      </w:r>
-      <w:r>
-        <w:rPr>
-          <w:rFonts w:ascii="Times New Roman" w:hAnsi="Times New Roman"/>
-          <w:i/>
-          <w:sz w:val="24"/>
-        </w:rPr>
-        <w:t>Research and Development</w:t>
-      </w:r>
-      <w:r>
-        <w:rPr>
-          <w:rFonts w:ascii="Times New Roman" w:hAnsi="Times New Roman"/>
-          <w:sz w:val="24"/>
-        </w:rPr>
-        <w:t xml:space="preserve"> (R&amp;D), yaitu penelitian yang bertujuan untuk menghasilkan produk tertentu dan menguji efektivitas produk tersebut. Produk yang dihasilkan dalam penelitian ini berupa:</w:t>
-      </w:r>
-    </w:p>
-    <w:p>
-      <w:pPr>
-        <w:ind w:left="720"/>
-        <w:jc w:val="both"/>
-      </w:pPr>
-      <w:r>
-        <w:rPr>
-          <w:rFonts w:ascii="Times New Roman" w:hAnsi="Times New Roman"/>
-          <w:sz w:val="24"/>
-        </w:rPr>
-        <w:t>1. Perangkat lunak ZZLUXORA (</w:t>
-      </w:r>
-      <w:r>
-        <w:rPr>
-          <w:rFonts w:ascii="Times New Roman" w:hAnsi="Times New Roman"/>
-          <w:i/>
-          <w:sz w:val="24"/>
-        </w:rPr>
-        <w:t>audio-reactive lighting design application</w:t>
-      </w:r>
-      <w:r>
-        <w:rPr>
-          <w:rFonts w:ascii="Times New Roman" w:hAnsi="Times New Roman"/>
-          <w:sz w:val="24"/>
-        </w:rPr>
-        <w:t>).</w:t>
-      </w:r>
-    </w:p>
-    <w:p>
-      <w:pPr>
-        <w:ind w:left="720"/>
-        <w:jc w:val="both"/>
-      </w:pPr>
-      <w:r>
-        <w:rPr>
-          <w:rFonts w:ascii="Times New Roman" w:hAnsi="Times New Roman"/>
-          <w:sz w:val="24"/>
-        </w:rPr>
-        <w:t xml:space="preserve">2. Modul </w:t>
-      </w:r>
-      <w:r>
-        <w:rPr>
-          <w:rFonts w:ascii="Times New Roman" w:hAnsi="Times New Roman"/>
-          <w:i/>
-          <w:sz w:val="24"/>
-        </w:rPr>
-        <w:t>hardware</w:t>
-      </w:r>
-      <w:r>
-        <w:rPr>
-          <w:rFonts w:ascii="Times New Roman" w:hAnsi="Times New Roman"/>
-          <w:sz w:val="24"/>
-        </w:rPr>
-        <w:t xml:space="preserve"> ARTNET-DMX berbasis ESP32.</w:t>
-      </w:r>
-    </w:p>
-    <w:p>
-      <w:pPr>
-        <w:ind w:left="720"/>
-        <w:jc w:val="both"/>
-      </w:pPr>
-      <w:r>
-        <w:rPr>
-          <w:rFonts w:ascii="Times New Roman" w:hAnsi="Times New Roman"/>
-          <w:sz w:val="24"/>
-        </w:rPr>
-        <w:t>3. Model matematis pemetaan fitur audio ke RGBW berbasis HSV.</w:t>
-      </w:r>
-    </w:p>
-    <w:p>
-      <w:pPr>
-        <w:spacing w:before="120" w:after="80"/>
-        <w:jc w:val="left"/>
-      </w:pPr>
-      <w:r>
-        <w:rPr>
-          <w:rFonts w:ascii="Times New Roman" w:hAnsi="Times New Roman"/>
-          <w:b/>
-          <w:sz w:val="24"/>
-        </w:rPr>
-        <w:t>3.1.3 Prosedur Penelitian</w:t>
-      </w:r>
-    </w:p>
-    <w:p>
-      <w:pPr>
-        <w:ind w:firstLine="720"/>
-        <w:jc w:val="both"/>
-      </w:pPr>
-      <w:r>
-        <w:rPr>
-          <w:rFonts w:ascii="Times New Roman" w:hAnsi="Times New Roman"/>
-          <w:sz w:val="24"/>
-        </w:rPr>
-        <w:t>Prosedur penelitian mengikuti tahapan pengembangan sistem sebagai berikut:</w:t>
-      </w:r>
-    </w:p>
-    <w:p>
-      <w:pPr>
-        <w:ind w:left="720"/>
-        <w:jc w:val="both"/>
-      </w:pPr>
-      <w:r>
-        <w:rPr>
-          <w:rFonts w:ascii="Times New Roman" w:hAnsi="Times New Roman"/>
-          <w:i/>
-          <w:sz w:val="24"/>
-        </w:rPr>
-        <w:t xml:space="preserve">1. </w:t>
-      </w:r>
-      <w:r>
-        <w:rPr>
-          <w:rFonts w:ascii="Times New Roman" w:hAnsi="Times New Roman"/>
-          <w:i/>
-          <w:sz w:val="24"/>
-        </w:rPr>
-        <w:t>Studi Literatur dan Analisis Kebutuhan:</w:t>
-      </w:r>
-      <w:r>
-        <w:rPr>
-          <w:rFonts w:ascii="Times New Roman" w:hAnsi="Times New Roman"/>
-          <w:sz w:val="24"/>
-        </w:rPr>
-        <w:t>* Kajian pustaka, identifikasi kebutuhan sistem, dan perancangan arsitektur.</w:t>
-      </w:r>
-    </w:p>
-    <w:p>
-      <w:pPr>
-        <w:ind w:left="720"/>
-        <w:jc w:val="both"/>
-      </w:pPr>
-      <w:r>
-        <w:rPr>
-          <w:rFonts w:ascii="Times New Roman" w:hAnsi="Times New Roman"/>
-          <w:i/>
-          <w:sz w:val="24"/>
-        </w:rPr>
-        <w:t xml:space="preserve">2. </w:t>
-      </w:r>
-      <w:r>
-        <w:rPr>
-          <w:rFonts w:ascii="Times New Roman" w:hAnsi="Times New Roman"/>
-          <w:i/>
-          <w:sz w:val="24"/>
-        </w:rPr>
-        <w:t>Perancangan Model Matematis:</w:t>
-      </w:r>
-      <w:r>
-        <w:rPr>
-          <w:rFonts w:ascii="Times New Roman" w:hAnsi="Times New Roman"/>
-          <w:sz w:val="24"/>
-        </w:rPr>
-      </w:r>
-      <w:r>
-        <w:rPr>
-          <w:rFonts w:ascii="Times New Roman" w:hAnsi="Times New Roman"/>
-          <w:i/>
-          <w:sz w:val="24"/>
-        </w:rPr>
-        <w:t xml:space="preserve"> Formulasi model pemetaan fitur audio → </w:t>
-      </w:r>
-      <w:r>
-        <w:rPr>
-          <w:rFonts w:ascii="Times New Roman" w:hAnsi="Times New Roman"/>
-          <w:sz w:val="24"/>
-        </w:rPr>
-        <w:t>Valence-Arousal</w:t>
-      </w:r>
-      <w:r>
-        <w:rPr>
-          <w:rFonts w:ascii="Times New Roman" w:hAnsi="Times New Roman"/>
-          <w:i/>
-          <w:sz w:val="24"/>
-        </w:rPr>
-        <w:t xml:space="preserve"> → HSV → RGBW beserta tabel </w:t>
-      </w:r>
-      <w:r>
-        <w:rPr>
-          <w:rFonts w:ascii="Times New Roman" w:hAnsi="Times New Roman"/>
-          <w:sz w:val="24"/>
-        </w:rPr>
-        <w:t>rule-based mapping* eksplisit.</w:t>
-      </w:r>
-    </w:p>
-    <w:p>
-      <w:pPr>
-        <w:ind w:left="720"/>
-        <w:jc w:val="both"/>
-      </w:pPr>
-      <w:r>
-        <w:rPr>
-          <w:rFonts w:ascii="Times New Roman" w:hAnsi="Times New Roman"/>
-          <w:i/>
-          <w:sz w:val="24"/>
-        </w:rPr>
-        <w:t xml:space="preserve">3. </w:t>
-      </w:r>
-      <w:r>
-        <w:rPr>
-          <w:rFonts w:ascii="Times New Roman" w:hAnsi="Times New Roman"/>
-          <w:i/>
-          <w:sz w:val="24"/>
-        </w:rPr>
-        <w:t>Pengembangan Perangkat Lunak:</w:t>
-      </w:r>
-      <w:r>
-        <w:rPr>
-          <w:rFonts w:ascii="Times New Roman" w:hAnsi="Times New Roman"/>
-          <w:sz w:val="24"/>
-        </w:rPr>
-      </w:r>
-      <w:r>
-        <w:rPr>
-          <w:rFonts w:ascii="Times New Roman" w:hAnsi="Times New Roman"/>
-          <w:i/>
-          <w:sz w:val="24"/>
-        </w:rPr>
-        <w:t xml:space="preserve"> Implementasi aplikasi ZZLUXORA meliputi modul analisis audio, </w:t>
-      </w:r>
-      <w:r>
-        <w:rPr>
-          <w:rFonts w:ascii="Times New Roman" w:hAnsi="Times New Roman"/>
-          <w:sz w:val="24"/>
-        </w:rPr>
-        <w:t>scene/chase generator</w:t>
-      </w:r>
-      <w:r>
-        <w:rPr>
-          <w:rFonts w:ascii="Times New Roman" w:hAnsi="Times New Roman"/>
-          <w:i/>
-          <w:sz w:val="24"/>
-        </w:rPr>
-        <w:t xml:space="preserve">, dan </w:t>
-      </w:r>
-      <w:r>
-        <w:rPr>
-          <w:rFonts w:ascii="Times New Roman" w:hAnsi="Times New Roman"/>
-          <w:sz w:val="24"/>
-        </w:rPr>
-        <w:t>Art-Net sender*.</w:t>
-      </w:r>
-    </w:p>
-    <w:p>
-      <w:pPr>
-        <w:ind w:left="720"/>
-        <w:jc w:val="both"/>
-      </w:pPr>
-      <w:r>
-        <w:rPr>
-          <w:rFonts w:ascii="Times New Roman" w:hAnsi="Times New Roman"/>
-          <w:i/>
-          <w:sz w:val="24"/>
-        </w:rPr>
-        <w:t xml:space="preserve">4. </w:t>
-      </w:r>
-      <w:r>
-        <w:rPr>
-          <w:rFonts w:ascii="Times New Roman" w:hAnsi="Times New Roman"/>
-          <w:i/>
-          <w:sz w:val="24"/>
-        </w:rPr>
-        <w:t>Pengembangan Perangkat Keras:</w:t>
-      </w:r>
-      <w:r>
-        <w:rPr>
-          <w:rFonts w:ascii="Times New Roman" w:hAnsi="Times New Roman"/>
-          <w:sz w:val="24"/>
-        </w:rPr>
-        <w:t>* Implementasi modul ARTNET-DMX (ESP32 + MAX485 + LCD I2C).</w:t>
-      </w:r>
-    </w:p>
-    <w:p>
-      <w:pPr>
-        <w:ind w:left="720"/>
-        <w:jc w:val="both"/>
-      </w:pPr>
-      <w:r>
-        <w:rPr>
-          <w:rFonts w:ascii="Times New Roman" w:hAnsi="Times New Roman"/>
-          <w:i/>
-          <w:sz w:val="24"/>
-        </w:rPr>
-        <w:t xml:space="preserve">5. </w:t>
-      </w:r>
-      <w:r>
-        <w:rPr>
-          <w:rFonts w:ascii="Times New Roman" w:hAnsi="Times New Roman"/>
-          <w:i/>
-          <w:sz w:val="24"/>
-        </w:rPr>
-        <w:t>Integrasi Sistem:</w:t>
-      </w:r>
-      <w:r>
-        <w:rPr>
-          <w:rFonts w:ascii="Times New Roman" w:hAnsi="Times New Roman"/>
-          <w:sz w:val="24"/>
-        </w:rPr>
-        <w:t>* Pengujian konektivitas ZZLUXORA ↔ QLC+ ↔ ESP32 ↔ PAR LED.</w:t>
-      </w:r>
-    </w:p>
-    <w:p>
-      <w:pPr>
-        <w:ind w:left="720"/>
-        <w:jc w:val="both"/>
-      </w:pPr>
-      <w:r>
-        <w:rPr>
-          <w:rFonts w:ascii="Times New Roman" w:hAnsi="Times New Roman"/>
-          <w:i/>
-          <w:sz w:val="24"/>
-        </w:rPr>
-        <w:t xml:space="preserve">6. </w:t>
-      </w:r>
-      <w:r>
-        <w:rPr>
-          <w:rFonts w:ascii="Times New Roman" w:hAnsi="Times New Roman"/>
-          <w:i/>
-          <w:sz w:val="24"/>
-        </w:rPr>
-        <w:t>Pengujian dan Evaluasi:</w:t>
-      </w:r>
-      <w:r>
-        <w:rPr>
-          <w:rFonts w:ascii="Times New Roman" w:hAnsi="Times New Roman"/>
-          <w:sz w:val="24"/>
-        </w:rPr>
-        <w:t>* Pengujian fungsional, performa, dan persepsi pengguna.</w:t>
-      </w:r>
-    </w:p>
-    <w:p>
-      <w:pPr>
-        <w:ind w:left="720"/>
-        <w:jc w:val="both"/>
-      </w:pPr>
-      <w:r>
-        <w:rPr>
-          <w:rFonts w:ascii="Times New Roman" w:hAnsi="Times New Roman"/>
-          <w:i/>
-          <w:sz w:val="24"/>
-        </w:rPr>
-        <w:t xml:space="preserve">7. </w:t>
-      </w:r>
-      <w:r>
-        <w:rPr>
-          <w:rFonts w:ascii="Times New Roman" w:hAnsi="Times New Roman"/>
-          <w:i/>
-          <w:sz w:val="24"/>
-        </w:rPr>
-        <w:t>Analisis Data dan Pelaporan:</w:t>
-      </w:r>
-      <w:r>
-        <w:rPr>
-          <w:rFonts w:ascii="Times New Roman" w:hAnsi="Times New Roman"/>
-          <w:sz w:val="24"/>
-        </w:rPr>
-        <w:t>* Analisis statistik hasil pengujian dan penyusunan laporan.</w:t>
-      </w:r>
-    </w:p>
-    <w:p>
-      <w:pPr>
-        <w:jc w:val="both"/>
-      </w:pPr>
-      <w:r>
-        <w:rPr>
-          <w:rFonts w:ascii="Times New Roman" w:hAnsi="Times New Roman"/>
-          <w:b/>
-          <w:sz w:val="24"/>
-        </w:rPr>
-        <w:t>Alur Program ZZLUXORA:</w:t>
-      </w:r>
-    </w:p>
-    <w:p>
-      <w:pPr>
         <w:jc w:val="center"/>
         <w:spacing w:before="240" w:after="120"/>
       </w:pPr>
@@ -10415,6 +9264,906 @@
           <w:b/>
           <w:sz w:val="22"/>
         </w:rPr>
+        <w:t>Gambar 2.4 </w:t>
+      </w:r>
+      <w:r>
+        <w:rPr>
+          <w:rFonts w:ascii="Times New Roman" w:hAnsi="Times New Roman"/>
+          <w:sz w:val="22"/>
+        </w:rPr>
+        <w:t>Diagram Kerangka Berpikir Penelitian Rancang Bangun Sistem Audio-Reactive Lighting Design ZZLUXORA</w:t>
+      </w:r>
+    </w:p>
+    <w:p>
+      <w:pPr>
+        <w:ind w:firstLine="720"/>
+        <w:jc w:val="both"/>
+      </w:pPr>
+      <w:r>
+        <w:rPr>
+          <w:rFonts w:ascii="Times New Roman" w:hAnsi="Times New Roman"/>
+          <w:sz w:val="24"/>
+        </w:rPr>
+        <w:t>Berdasarkan kerangka berpikir di atas, sistem yang dibangun menghubungkan domain audio (</w:t>
+      </w:r>
+      <w:r>
+        <w:rPr>
+          <w:rFonts w:ascii="Times New Roman" w:hAnsi="Times New Roman"/>
+          <w:i/>
+          <w:sz w:val="24"/>
+        </w:rPr>
+        <w:t>input</w:t>
+      </w:r>
+      <w:r>
+        <w:rPr>
+          <w:rFonts w:ascii="Times New Roman" w:hAnsi="Times New Roman"/>
+          <w:sz w:val="24"/>
+        </w:rPr>
+        <w:t>) dengan domain visual (</w:t>
+      </w:r>
+      <w:r>
+        <w:rPr>
+          <w:rFonts w:ascii="Times New Roman" w:hAnsi="Times New Roman"/>
+          <w:i/>
+          <w:sz w:val="24"/>
+        </w:rPr>
+        <w:t>output</w:t>
+      </w:r>
+      <w:r>
+        <w:rPr>
+          <w:rFonts w:ascii="Times New Roman" w:hAnsi="Times New Roman"/>
+          <w:sz w:val="24"/>
+        </w:rPr>
+        <w:t>) melalui serangkaian transformasi matematis yang dapat diuji dan diverifikasi secara objektif. Penilaian akhir kesesuaian dilakukan melalui dua pendekatan: (1) uji objektif berupa konsistensi dan determinisme pemetaan serta korelasi statistik antara fitur audio dan nilai RGBW, dan (2) uji subjektif berupa persepsi pengguna terhadap kesesuaian pencahayaan dengan karakteristik lagu.</w:t>
+      </w:r>
+    </w:p>
+    <w:p>
+      <w:pPr>
+        <w:spacing w:before="240" w:after="120"/>
+        <w:jc w:val="left"/>
+      </w:pPr>
+      <w:r>
+        <w:rPr>
+          <w:rFonts w:ascii="Times New Roman" w:hAnsi="Times New Roman"/>
+          <w:b/>
+          <w:sz w:val="24"/>
+        </w:rPr>
+        <w:t>2.4 Hipotesis Teoritis</w:t>
+      </w:r>
+    </w:p>
+    <w:p>
+      <w:pPr>
+        <w:ind w:firstLine="720"/>
+        <w:jc w:val="both"/>
+      </w:pPr>
+      <w:r>
+        <w:rPr>
+          <w:rFonts w:ascii="Times New Roman" w:hAnsi="Times New Roman"/>
+          <w:sz w:val="24"/>
+        </w:rPr>
+        <w:t>Berdasarkan kajian pustaka dan kerangka berpikir yang telah diuraikan, hipotesis teoritis dalam penelitian ini adalah sebagai berikut:</w:t>
+      </w:r>
+    </w:p>
+    <w:p>
+      <w:pPr>
+        <w:ind w:left="720"/>
+        <w:jc w:val="both"/>
+      </w:pPr>
+      <w:r>
+        <w:rPr>
+          <w:rFonts w:ascii="Times New Roman" w:hAnsi="Times New Roman"/>
+          <w:sz w:val="24"/>
+        </w:rPr>
+        <w:t xml:space="preserve">1. Fitur-fitur audio lagu rohani (BPM, </w:t>
+      </w:r>
+      <w:r>
+        <w:rPr>
+          <w:rFonts w:ascii="Times New Roman" w:hAnsi="Times New Roman"/>
+          <w:i/>
+          <w:sz w:val="24"/>
+        </w:rPr>
+        <w:t>RMS energy</w:t>
+      </w:r>
+      <w:r>
+        <w:rPr>
+          <w:rFonts w:ascii="Times New Roman" w:hAnsi="Times New Roman"/>
+          <w:sz w:val="24"/>
+        </w:rPr>
+        <w:t xml:space="preserve">, </w:t>
+      </w:r>
+      <w:r>
+        <w:rPr>
+          <w:rFonts w:ascii="Times New Roman" w:hAnsi="Times New Roman"/>
+          <w:i/>
+          <w:sz w:val="24"/>
+        </w:rPr>
+        <w:t>spectral centroid</w:t>
+      </w:r>
+      <w:r>
+        <w:rPr>
+          <w:rFonts w:ascii="Times New Roman" w:hAnsi="Times New Roman"/>
+          <w:sz w:val="24"/>
+        </w:rPr>
+        <w:t xml:space="preserve">, </w:t>
+      </w:r>
+      <w:r>
+        <w:rPr>
+          <w:rFonts w:ascii="Times New Roman" w:hAnsi="Times New Roman"/>
+          <w:i/>
+          <w:sz w:val="24"/>
+        </w:rPr>
+        <w:t>chroma features</w:t>
+      </w:r>
+      <w:r>
+        <w:rPr>
+          <w:rFonts w:ascii="Times New Roman" w:hAnsi="Times New Roman"/>
+          <w:sz w:val="24"/>
+        </w:rPr>
+        <w:t xml:space="preserve">) dapat dipetakan secara sistematis ke parameter pencahayaan RGBW melalui model matematis </w:t>
+      </w:r>
+      <w:r>
+        <w:rPr>
+          <w:rFonts w:ascii="Times New Roman" w:hAnsi="Times New Roman"/>
+          <w:i/>
+          <w:sz w:val="24"/>
+        </w:rPr>
+        <w:t>rule-based</w:t>
+      </w:r>
+      <w:r>
+        <w:rPr>
+          <w:rFonts w:ascii="Times New Roman" w:hAnsi="Times New Roman"/>
+          <w:sz w:val="24"/>
+        </w:rPr>
+        <w:t xml:space="preserve"> berbasis ruang warna HSV, dengan dasar referensi korelasi musik-warna dari Palmer </w:t>
+      </w:r>
+      <w:r>
+        <w:rPr>
+          <w:rFonts w:ascii="Times New Roman" w:hAnsi="Times New Roman"/>
+          <w:i/>
+          <w:sz w:val="24"/>
+        </w:rPr>
+        <w:t>et al.</w:t>
+      </w:r>
+      <w:r>
+        <w:rPr>
+          <w:rFonts w:ascii="Times New Roman" w:hAnsi="Times New Roman"/>
+          <w:sz w:val="24"/>
+        </w:rPr>
+        <w:t xml:space="preserve"> (2013) dan Lindborg (2021).</w:t>
+      </w:r>
+    </w:p>
+    <w:p>
+      <w:pPr>
+        <w:ind w:left="720"/>
+        <w:jc w:val="both"/>
+      </w:pPr>
+      <w:r>
+        <w:rPr>
+          <w:rFonts w:ascii="Times New Roman" w:hAnsi="Times New Roman"/>
+          <w:sz w:val="24"/>
+        </w:rPr>
+        <w:t xml:space="preserve">2. Sistem </w:t>
+      </w:r>
+      <w:r>
+        <w:rPr>
+          <w:rFonts w:ascii="Times New Roman" w:hAnsi="Times New Roman"/>
+          <w:i/>
+          <w:sz w:val="24"/>
+        </w:rPr>
+        <w:t>audio-reactive lighting</w:t>
+      </w:r>
+      <w:r>
+        <w:rPr>
+          <w:rFonts w:ascii="Times New Roman" w:hAnsi="Times New Roman"/>
+          <w:sz w:val="24"/>
+        </w:rPr>
+        <w:t xml:space="preserve"> yang dibangun mampu menghasilkan </w:t>
+      </w:r>
+      <w:r>
+        <w:rPr>
+          <w:rFonts w:ascii="Times New Roman" w:hAnsi="Times New Roman"/>
+          <w:i/>
+          <w:sz w:val="24"/>
+        </w:rPr>
+        <w:t>scene</w:t>
+      </w:r>
+      <w:r>
+        <w:rPr>
+          <w:rFonts w:ascii="Times New Roman" w:hAnsi="Times New Roman"/>
+          <w:sz w:val="24"/>
+        </w:rPr>
+        <w:t xml:space="preserve"> dan </w:t>
+      </w:r>
+      <w:r>
+        <w:rPr>
+          <w:rFonts w:ascii="Times New Roman" w:hAnsi="Times New Roman"/>
+          <w:i/>
+          <w:sz w:val="24"/>
+        </w:rPr>
+        <w:t>chase</w:t>
+      </w:r>
+      <w:r>
+        <w:rPr>
+          <w:rFonts w:ascii="Times New Roman" w:hAnsi="Times New Roman"/>
+          <w:sz w:val="24"/>
+        </w:rPr>
+        <w:t xml:space="preserve"> pencahayaan yang dipersepsikan sesuai dengan karakteristik audio lagu rohani oleh pengguna.</w:t>
+      </w:r>
+    </w:p>
+    <w:p>
+      <w:pPr>
+        <w:ind w:left="720"/>
+        <w:jc w:val="both"/>
+      </w:pPr>
+      <w:r>
+        <w:rPr>
+          <w:rFonts w:ascii="Times New Roman" w:hAnsi="Times New Roman"/>
+          <w:sz w:val="24"/>
+        </w:rPr>
+        <w:t xml:space="preserve">3. Integrasi protokol </w:t>
+      </w:r>
+      <w:r>
+        <w:rPr>
+          <w:rFonts w:ascii="Times New Roman" w:hAnsi="Times New Roman"/>
+          <w:i/>
+          <w:sz w:val="24"/>
+        </w:rPr>
+        <w:t>Art-Net</w:t>
+      </w:r>
+      <w:r>
+        <w:rPr>
+          <w:rFonts w:ascii="Times New Roman" w:hAnsi="Times New Roman"/>
+          <w:sz w:val="24"/>
+        </w:rPr>
+        <w:t xml:space="preserve"> DMX512 melalui jaringan nirkabel (WiFi/</w:t>
+      </w:r>
+      <w:r>
+        <w:rPr>
+          <w:rFonts w:ascii="Times New Roman" w:hAnsi="Times New Roman"/>
+          <w:i/>
+          <w:sz w:val="24"/>
+        </w:rPr>
+        <w:t>hotspot</w:t>
+      </w:r>
+      <w:r>
+        <w:rPr>
+          <w:rFonts w:ascii="Times New Roman" w:hAnsi="Times New Roman"/>
+          <w:sz w:val="24"/>
+        </w:rPr>
+        <w:t xml:space="preserve">) ke modul ESP32 mampu mengendalikan lampu PAR LED RGBW dengan </w:t>
+      </w:r>
+      <w:r>
+        <w:rPr>
+          <w:rFonts w:ascii="Times New Roman" w:hAnsi="Times New Roman"/>
+          <w:i/>
+          <w:sz w:val="24"/>
+        </w:rPr>
+        <w:t>latency</w:t>
+      </w:r>
+      <w:r>
+        <w:rPr>
+          <w:rFonts w:ascii="Times New Roman" w:hAnsi="Times New Roman"/>
+          <w:sz w:val="24"/>
+        </w:rPr>
+        <w:t xml:space="preserve"> yang dapat diterima untuk penggunaan ibadah secara </w:t>
+      </w:r>
+      <w:r>
+        <w:rPr>
+          <w:rFonts w:ascii="Times New Roman" w:hAnsi="Times New Roman"/>
+          <w:i/>
+          <w:sz w:val="24"/>
+        </w:rPr>
+        <w:t>real-time</w:t>
+      </w:r>
+      <w:r>
+        <w:rPr>
+          <w:rFonts w:ascii="Times New Roman" w:hAnsi="Times New Roman"/>
+          <w:sz w:val="24"/>
+        </w:rPr>
+        <w:t>.</w:t>
+      </w:r>
+    </w:p>
+    <w:p>
+      <w:r>
+        <w:br w:type="page"/>
+      </w:r>
+    </w:p>
+    <w:p>
+      <w:pPr>
+        <w:spacing w:before="240" w:after="240"/>
+        <w:jc w:val="center"/>
+      </w:pPr>
+      <w:r>
+        <w:rPr>
+          <w:rFonts w:ascii="Times New Roman" w:hAnsi="Times New Roman"/>
+          <w:b/>
+          <w:sz w:val="28"/>
+        </w:rPr>
+        <w:t>BAB 3 METODE PENELITIAN</w:t>
+      </w:r>
+    </w:p>
+    <w:p>
+      <w:pPr>
+        <w:spacing w:before="240" w:after="120"/>
+        <w:jc w:val="left"/>
+      </w:pPr>
+      <w:r>
+        <w:rPr>
+          <w:rFonts w:ascii="Times New Roman" w:hAnsi="Times New Roman"/>
+          <w:b/>
+          <w:sz w:val="24"/>
+        </w:rPr>
+        <w:t>3.1 Pendekatan, Jenis, dan Prosedur Penelitian</w:t>
+      </w:r>
+    </w:p>
+    <w:p>
+      <w:pPr>
+        <w:spacing w:before="120" w:after="80"/>
+        <w:jc w:val="left"/>
+      </w:pPr>
+      <w:r>
+        <w:rPr>
+          <w:rFonts w:ascii="Times New Roman" w:hAnsi="Times New Roman"/>
+          <w:b/>
+          <w:sz w:val="24"/>
+        </w:rPr>
+        <w:t>3.1.1 Pendekatan Penelitian</w:t>
+      </w:r>
+    </w:p>
+    <w:p>
+      <w:pPr>
+        <w:ind w:firstLine="720"/>
+        <w:jc w:val="both"/>
+      </w:pPr>
+      <w:r>
+        <w:rPr>
+          <w:rFonts w:ascii="Times New Roman" w:hAnsi="Times New Roman"/>
+          <w:sz w:val="24"/>
+        </w:rPr>
+        <w:t xml:space="preserve">Penelitian ini menggunakan pendekatan kuantitatif, yaitu pendekatan yang menekankan pada pengumpulan dan analisis data berupa angka-angka untuk menguji hipotesis dan mengukur variabel penelitian secara objektif. Data kuantitatif yang dikumpulkan meliputi nilai-nilai fitur audio (BPM, </w:t>
+      </w:r>
+      <w:r>
+        <w:rPr>
+          <w:rFonts w:ascii="Times New Roman" w:hAnsi="Times New Roman"/>
+          <w:i/>
+          <w:sz w:val="24"/>
+        </w:rPr>
+        <w:t>RMS</w:t>
+      </w:r>
+      <w:r>
+        <w:rPr>
+          <w:rFonts w:ascii="Times New Roman" w:hAnsi="Times New Roman"/>
+          <w:sz w:val="24"/>
+        </w:rPr>
+        <w:t xml:space="preserve">, </w:t>
+      </w:r>
+      <w:r>
+        <w:rPr>
+          <w:rFonts w:ascii="Times New Roman" w:hAnsi="Times New Roman"/>
+          <w:i/>
+          <w:sz w:val="24"/>
+        </w:rPr>
+        <w:t>spectral centroid</w:t>
+      </w:r>
+      <w:r>
+        <w:rPr>
+          <w:rFonts w:ascii="Times New Roman" w:hAnsi="Times New Roman"/>
+          <w:sz w:val="24"/>
+        </w:rPr>
+        <w:t xml:space="preserve">), nilai </w:t>
+      </w:r>
+      <w:r>
+        <w:rPr>
+          <w:rFonts w:ascii="Times New Roman" w:hAnsi="Times New Roman"/>
+          <w:i/>
+          <w:sz w:val="24"/>
+        </w:rPr>
+        <w:t>output</w:t>
+      </w:r>
+      <w:r>
+        <w:rPr>
+          <w:rFonts w:ascii="Times New Roman" w:hAnsi="Times New Roman"/>
+          <w:sz w:val="24"/>
+        </w:rPr>
+        <w:t xml:space="preserve"> RGBW, waktu </w:t>
+      </w:r>
+      <w:r>
+        <w:rPr>
+          <w:rFonts w:ascii="Times New Roman" w:hAnsi="Times New Roman"/>
+          <w:i/>
+          <w:sz w:val="24"/>
+        </w:rPr>
+        <w:t>latency</w:t>
+      </w:r>
+      <w:r>
+        <w:rPr>
+          <w:rFonts w:ascii="Times New Roman" w:hAnsi="Times New Roman"/>
+          <w:sz w:val="24"/>
+        </w:rPr>
+        <w:t xml:space="preserve">, skor </w:t>
+      </w:r>
+      <w:r>
+        <w:rPr>
+          <w:rFonts w:ascii="Times New Roman" w:hAnsi="Times New Roman"/>
+          <w:i/>
+          <w:sz w:val="24"/>
+        </w:rPr>
+        <w:t>usability</w:t>
+      </w:r>
+      <w:r>
+        <w:rPr>
+          <w:rFonts w:ascii="Times New Roman" w:hAnsi="Times New Roman"/>
+          <w:sz w:val="24"/>
+        </w:rPr>
+        <w:t xml:space="preserve"> (SUS), dan skor kesesuaian pencahayaan.</w:t>
+      </w:r>
+    </w:p>
+    <w:p>
+      <w:pPr>
+        <w:spacing w:before="120" w:after="80"/>
+        <w:jc w:val="left"/>
+      </w:pPr>
+      <w:r>
+        <w:rPr>
+          <w:rFonts w:ascii="Times New Roman" w:hAnsi="Times New Roman"/>
+          <w:b/>
+          <w:sz w:val="24"/>
+        </w:rPr>
+        <w:t>3.1.2 Jenis Penelitian</w:t>
+      </w:r>
+    </w:p>
+    <w:p>
+      <w:pPr>
+        <w:ind w:firstLine="720"/>
+        <w:jc w:val="both"/>
+      </w:pPr>
+      <w:r>
+        <w:rPr>
+          <w:rFonts w:ascii="Times New Roman" w:hAnsi="Times New Roman"/>
+          <w:sz w:val="24"/>
+        </w:rPr>
+        <w:t xml:space="preserve">Jenis penelitian ini adalah </w:t>
+      </w:r>
+      <w:r>
+        <w:rPr>
+          <w:rFonts w:ascii="Times New Roman" w:hAnsi="Times New Roman"/>
+          <w:i/>
+          <w:sz w:val="24"/>
+        </w:rPr>
+        <w:t>Research and Development</w:t>
+      </w:r>
+      <w:r>
+        <w:rPr>
+          <w:rFonts w:ascii="Times New Roman" w:hAnsi="Times New Roman"/>
+          <w:sz w:val="24"/>
+        </w:rPr>
+        <w:t xml:space="preserve"> (R&amp;D), yaitu penelitian yang bertujuan untuk menghasilkan produk tertentu dan menguji efektivitas produk tersebut. Produk yang dihasilkan dalam penelitian ini berupa:</w:t>
+      </w:r>
+    </w:p>
+    <w:p>
+      <w:pPr>
+        <w:ind w:left="720"/>
+        <w:jc w:val="both"/>
+      </w:pPr>
+      <w:r>
+        <w:rPr>
+          <w:rFonts w:ascii="Times New Roman" w:hAnsi="Times New Roman"/>
+          <w:sz w:val="24"/>
+        </w:rPr>
+        <w:t>1. Perangkat lunak ZZLUXORA (</w:t>
+      </w:r>
+      <w:r>
+        <w:rPr>
+          <w:rFonts w:ascii="Times New Roman" w:hAnsi="Times New Roman"/>
+          <w:i/>
+          <w:sz w:val="24"/>
+        </w:rPr>
+        <w:t>audio-reactive lighting design application</w:t>
+      </w:r>
+      <w:r>
+        <w:rPr>
+          <w:rFonts w:ascii="Times New Roman" w:hAnsi="Times New Roman"/>
+          <w:sz w:val="24"/>
+        </w:rPr>
+        <w:t>).</w:t>
+      </w:r>
+    </w:p>
+    <w:p>
+      <w:pPr>
+        <w:ind w:left="720"/>
+        <w:jc w:val="both"/>
+      </w:pPr>
+      <w:r>
+        <w:rPr>
+          <w:rFonts w:ascii="Times New Roman" w:hAnsi="Times New Roman"/>
+          <w:sz w:val="24"/>
+        </w:rPr>
+        <w:t xml:space="preserve">2. Modul </w:t>
+      </w:r>
+      <w:r>
+        <w:rPr>
+          <w:rFonts w:ascii="Times New Roman" w:hAnsi="Times New Roman"/>
+          <w:i/>
+          <w:sz w:val="24"/>
+        </w:rPr>
+        <w:t>hardware</w:t>
+      </w:r>
+      <w:r>
+        <w:rPr>
+          <w:rFonts w:ascii="Times New Roman" w:hAnsi="Times New Roman"/>
+          <w:sz w:val="24"/>
+        </w:rPr>
+        <w:t xml:space="preserve"> ARTNET-DMX berbasis ESP32.</w:t>
+      </w:r>
+    </w:p>
+    <w:p>
+      <w:pPr>
+        <w:ind w:left="720"/>
+        <w:jc w:val="both"/>
+      </w:pPr>
+      <w:r>
+        <w:rPr>
+          <w:rFonts w:ascii="Times New Roman" w:hAnsi="Times New Roman"/>
+          <w:sz w:val="24"/>
+        </w:rPr>
+        <w:t>3. Model matematis pemetaan fitur audio ke RGBW berbasis HSV.</w:t>
+      </w:r>
+    </w:p>
+    <w:p>
+      <w:pPr>
+        <w:spacing w:before="120" w:after="80"/>
+        <w:jc w:val="left"/>
+      </w:pPr>
+      <w:r>
+        <w:rPr>
+          <w:rFonts w:ascii="Times New Roman" w:hAnsi="Times New Roman"/>
+          <w:b/>
+          <w:sz w:val="24"/>
+        </w:rPr>
+        <w:t>3.1.3 Prosedur Penelitian</w:t>
+      </w:r>
+    </w:p>
+    <w:p>
+      <w:pPr>
+        <w:ind w:firstLine="720"/>
+        <w:jc w:val="both"/>
+      </w:pPr>
+      <w:r>
+        <w:rPr>
+          <w:rFonts w:ascii="Times New Roman" w:hAnsi="Times New Roman"/>
+          <w:sz w:val="24"/>
+        </w:rPr>
+        <w:t>Prosedur penelitian mengikuti tahapan pengembangan sistem sebagai berikut:</w:t>
+      </w:r>
+    </w:p>
+    <w:p>
+      <w:pPr>
+        <w:ind w:left="720"/>
+        <w:jc w:val="both"/>
+      </w:pPr>
+      <w:r>
+        <w:rPr>
+          <w:rFonts w:ascii="Times New Roman" w:hAnsi="Times New Roman"/>
+          <w:i/>
+          <w:sz w:val="24"/>
+        </w:rPr>
+        <w:t xml:space="preserve">1. </w:t>
+      </w:r>
+      <w:r>
+        <w:rPr>
+          <w:rFonts w:ascii="Times New Roman" w:hAnsi="Times New Roman"/>
+          <w:i/>
+          <w:sz w:val="24"/>
+        </w:rPr>
+        <w:t>Studi Literatur dan Analisis Kebutuhan:</w:t>
+      </w:r>
+      <w:r>
+        <w:rPr>
+          <w:rFonts w:ascii="Times New Roman" w:hAnsi="Times New Roman"/>
+          <w:sz w:val="24"/>
+        </w:rPr>
+        <w:t>* Kajian pustaka, identifikasi kebutuhan sistem, dan perancangan arsitektur.</w:t>
+      </w:r>
+    </w:p>
+    <w:p>
+      <w:pPr>
+        <w:ind w:left="720"/>
+        <w:jc w:val="both"/>
+      </w:pPr>
+      <w:r>
+        <w:rPr>
+          <w:rFonts w:ascii="Times New Roman" w:hAnsi="Times New Roman"/>
+          <w:i/>
+          <w:sz w:val="24"/>
+        </w:rPr>
+        <w:t xml:space="preserve">2. </w:t>
+      </w:r>
+      <w:r>
+        <w:rPr>
+          <w:rFonts w:ascii="Times New Roman" w:hAnsi="Times New Roman"/>
+          <w:i/>
+          <w:sz w:val="24"/>
+        </w:rPr>
+        <w:t>Perancangan Model Matematis:</w:t>
+      </w:r>
+      <w:r>
+        <w:rPr>
+          <w:rFonts w:ascii="Times New Roman" w:hAnsi="Times New Roman"/>
+          <w:sz w:val="24"/>
+        </w:rPr>
+      </w:r>
+      <w:r>
+        <w:rPr>
+          <w:rFonts w:ascii="Times New Roman" w:hAnsi="Times New Roman"/>
+          <w:i/>
+          <w:sz w:val="24"/>
+        </w:rPr>
+        <w:t xml:space="preserve"> Formulasi model pemetaan fitur audio → </w:t>
+      </w:r>
+      <w:r>
+        <w:rPr>
+          <w:rFonts w:ascii="Times New Roman" w:hAnsi="Times New Roman"/>
+          <w:sz w:val="24"/>
+        </w:rPr>
+        <w:t>Valence-Arousal</w:t>
+      </w:r>
+      <w:r>
+        <w:rPr>
+          <w:rFonts w:ascii="Times New Roman" w:hAnsi="Times New Roman"/>
+          <w:i/>
+          <w:sz w:val="24"/>
+        </w:rPr>
+        <w:t xml:space="preserve"> → HSV → RGBW beserta tabel </w:t>
+      </w:r>
+      <w:r>
+        <w:rPr>
+          <w:rFonts w:ascii="Times New Roman" w:hAnsi="Times New Roman"/>
+          <w:sz w:val="24"/>
+        </w:rPr>
+        <w:t>rule-based mapping* eksplisit.</w:t>
+      </w:r>
+    </w:p>
+    <w:p>
+      <w:pPr>
+        <w:ind w:left="720"/>
+        <w:jc w:val="both"/>
+      </w:pPr>
+      <w:r>
+        <w:rPr>
+          <w:rFonts w:ascii="Times New Roman" w:hAnsi="Times New Roman"/>
+          <w:i/>
+          <w:sz w:val="24"/>
+        </w:rPr>
+        <w:t xml:space="preserve">3. </w:t>
+      </w:r>
+      <w:r>
+        <w:rPr>
+          <w:rFonts w:ascii="Times New Roman" w:hAnsi="Times New Roman"/>
+          <w:i/>
+          <w:sz w:val="24"/>
+        </w:rPr>
+        <w:t>Pengembangan Perangkat Lunak:</w:t>
+      </w:r>
+      <w:r>
+        <w:rPr>
+          <w:rFonts w:ascii="Times New Roman" w:hAnsi="Times New Roman"/>
+          <w:sz w:val="24"/>
+        </w:rPr>
+      </w:r>
+      <w:r>
+        <w:rPr>
+          <w:rFonts w:ascii="Times New Roman" w:hAnsi="Times New Roman"/>
+          <w:i/>
+          <w:sz w:val="24"/>
+        </w:rPr>
+        <w:t xml:space="preserve"> Implementasi aplikasi ZZLUXORA meliputi modul analisis audio, </w:t>
+      </w:r>
+      <w:r>
+        <w:rPr>
+          <w:rFonts w:ascii="Times New Roman" w:hAnsi="Times New Roman"/>
+          <w:sz w:val="24"/>
+        </w:rPr>
+        <w:t>scene/chase generator</w:t>
+      </w:r>
+      <w:r>
+        <w:rPr>
+          <w:rFonts w:ascii="Times New Roman" w:hAnsi="Times New Roman"/>
+          <w:i/>
+          <w:sz w:val="24"/>
+        </w:rPr>
+        <w:t xml:space="preserve">, dan </w:t>
+      </w:r>
+      <w:r>
+        <w:rPr>
+          <w:rFonts w:ascii="Times New Roman" w:hAnsi="Times New Roman"/>
+          <w:sz w:val="24"/>
+        </w:rPr>
+        <w:t>Art-Net sender*.</w:t>
+      </w:r>
+    </w:p>
+    <w:p>
+      <w:pPr>
+        <w:ind w:left="720"/>
+        <w:jc w:val="both"/>
+      </w:pPr>
+      <w:r>
+        <w:rPr>
+          <w:rFonts w:ascii="Times New Roman" w:hAnsi="Times New Roman"/>
+          <w:i/>
+          <w:sz w:val="24"/>
+        </w:rPr>
+        <w:t xml:space="preserve">4. </w:t>
+      </w:r>
+      <w:r>
+        <w:rPr>
+          <w:rFonts w:ascii="Times New Roman" w:hAnsi="Times New Roman"/>
+          <w:i/>
+          <w:sz w:val="24"/>
+        </w:rPr>
+        <w:t>Pengembangan Perangkat Keras:</w:t>
+      </w:r>
+      <w:r>
+        <w:rPr>
+          <w:rFonts w:ascii="Times New Roman" w:hAnsi="Times New Roman"/>
+          <w:sz w:val="24"/>
+        </w:rPr>
+        <w:t>* Implementasi modul ARTNET-DMX (ESP32 + MAX485 + LCD I2C).</w:t>
+      </w:r>
+    </w:p>
+    <w:p>
+      <w:pPr>
+        <w:ind w:left="720"/>
+        <w:jc w:val="both"/>
+      </w:pPr>
+      <w:r>
+        <w:rPr>
+          <w:rFonts w:ascii="Times New Roman" w:hAnsi="Times New Roman"/>
+          <w:i/>
+          <w:sz w:val="24"/>
+        </w:rPr>
+        <w:t xml:space="preserve">5. </w:t>
+      </w:r>
+      <w:r>
+        <w:rPr>
+          <w:rFonts w:ascii="Times New Roman" w:hAnsi="Times New Roman"/>
+          <w:i/>
+          <w:sz w:val="24"/>
+        </w:rPr>
+        <w:t>Integrasi Sistem:</w:t>
+      </w:r>
+      <w:r>
+        <w:rPr>
+          <w:rFonts w:ascii="Times New Roman" w:hAnsi="Times New Roman"/>
+          <w:sz w:val="24"/>
+        </w:rPr>
+        <w:t>* Pengujian konektivitas ZZLUXORA ↔ QLC+ ↔ ESP32 ↔ PAR LED.</w:t>
+      </w:r>
+    </w:p>
+    <w:p>
+      <w:pPr>
+        <w:ind w:left="720"/>
+        <w:jc w:val="both"/>
+      </w:pPr>
+      <w:r>
+        <w:rPr>
+          <w:rFonts w:ascii="Times New Roman" w:hAnsi="Times New Roman"/>
+          <w:i/>
+          <w:sz w:val="24"/>
+        </w:rPr>
+        <w:t xml:space="preserve">6. </w:t>
+      </w:r>
+      <w:r>
+        <w:rPr>
+          <w:rFonts w:ascii="Times New Roman" w:hAnsi="Times New Roman"/>
+          <w:i/>
+          <w:sz w:val="24"/>
+        </w:rPr>
+        <w:t>Pengujian dan Evaluasi:</w:t>
+      </w:r>
+      <w:r>
+        <w:rPr>
+          <w:rFonts w:ascii="Times New Roman" w:hAnsi="Times New Roman"/>
+          <w:sz w:val="24"/>
+        </w:rPr>
+        <w:t>* Pengujian fungsional, performa, dan persepsi pengguna.</w:t>
+      </w:r>
+    </w:p>
+    <w:p>
+      <w:pPr>
+        <w:ind w:left="720"/>
+        <w:jc w:val="both"/>
+      </w:pPr>
+      <w:r>
+        <w:rPr>
+          <w:rFonts w:ascii="Times New Roman" w:hAnsi="Times New Roman"/>
+          <w:i/>
+          <w:sz w:val="24"/>
+        </w:rPr>
+        <w:t xml:space="preserve">7. </w:t>
+      </w:r>
+      <w:r>
+        <w:rPr>
+          <w:rFonts w:ascii="Times New Roman" w:hAnsi="Times New Roman"/>
+          <w:i/>
+          <w:sz w:val="24"/>
+        </w:rPr>
+        <w:t>Analisis Data dan Pelaporan:</w:t>
+      </w:r>
+      <w:r>
+        <w:rPr>
+          <w:rFonts w:ascii="Times New Roman" w:hAnsi="Times New Roman"/>
+          <w:sz w:val="24"/>
+        </w:rPr>
+        <w:t>* Analisis statistik hasil pengujian dan penyusunan laporan.</w:t>
+      </w:r>
+    </w:p>
+    <w:p>
+      <w:pPr>
+        <w:jc w:val="both"/>
+      </w:pPr>
+      <w:r>
+        <w:rPr>
+          <w:rFonts w:ascii="Times New Roman" w:hAnsi="Times New Roman"/>
+          <w:b/>
+          <w:sz w:val="24"/>
+        </w:rPr>
+        <w:t>Alur Program ZZLUXORA:</w:t>
+      </w:r>
+    </w:p>
+    <w:p>
+      <w:pPr>
+        <w:jc w:val="center"/>
+        <w:spacing w:before="240" w:after="120"/>
+      </w:pPr>
+      <w:r>
+        <w:drawing>
+          <wp:inline distT="0" distB="0" distL="0" distR="0">
+            <wp:extent cx="4800000" cy="3000000"/>
+            <wp:effectExtent l="0" t="0" r="0" b="0"/>
+            <wp:docPr id="14" name="Picture 14"/>
+            <wp:cNvGraphicFramePr>
+              <a:graphicFrameLocks noChangeAspect="1"/>
+            </wp:cNvGraphicFramePr>
+            <a:graphic>
+              <a:graphicData uri="http://schemas.openxmlformats.org/drawingml/2006/main/picture">
+                <pic:pic>
+                  <pic:nvPicPr>
+                    <pic:cNvPr id="14" name="Image 14"/>
+                    <pic:cNvPicPr/>
+                  </pic:nvPicPr>
+                  <pic:blipFill>
+                    <a:blip r:embed="rId14"/>
+                    <a:stretch>
+                      <a:fillRect/>
+                    </a:stretch>
+                  </pic:blipFill>
+                  <pic:spPr>
+                    <a:xfrm>
+                      <a:off x="0" y="0"/>
+                      <a:ext cx="4800000" cy="3000000"/>
+                    </a:xfrm>
+                    <a:prstGeom prst="rect">
+                      <a:avLst/>
+                    </a:prstGeom>
+                  </pic:spPr>
+                </pic:pic>
+              </a:graphicData>
+            </a:graphic>
+          </wp:inline>
+        </w:drawing>
+      </w:r>
+    </w:p>
+    <w:p>
+      <w:pPr>
+        <w:jc w:val="center"/>
+        <w:spacing w:line="240" w:lineRule="auto" w:after="240"/>
+      </w:pPr>
+      <w:r>
+        <w:rPr>
+          <w:rFonts w:ascii="Times New Roman" w:hAnsi="Times New Roman"/>
+          <w:b/>
+          <w:sz w:val="22"/>
+        </w:rPr>
         <w:t>Gambar 3.1 </w:t>
       </w:r>
       <w:r>
@@ -10427,78 +10176,6 @@
     </w:p>
     <w:p>
       <w:pPr>
-        <w:ind w:left="567"/>
-      </w:pPr>
-      <w:r>
-        <w:rPr>
-          <w:rFonts w:ascii="Courier New" w:hAnsi="Courier New"/>
-          <w:sz w:val="18"/>
-        </w:rPr>
-        <w:t>START</w:t>
-        <w:br/>
-        <w:t xml:space="preserve">  │</w:t>
-        <w:br/>
-        <w:t xml:space="preserve">  ├── User memilih file audio (.mp3/.wav)</w:t>
-        <w:br/>
-        <w:t xml:space="preserve">  │</w:t>
-        <w:br/>
-        <w:t xml:space="preserve">  ├── User mengatur konfigurasi fixture</w:t>
-        <w:br/>
-        <w:t xml:space="preserve">  │   (jumlah lampu, channel mapping)</w:t>
-        <w:br/>
-        <w:t xml:space="preserve">  │</w:t>
-        <w:br/>
-        <w:t xml:space="preserve">  ├── Klik tombol "Analyze"</w:t>
-        <w:br/>
-        <w:t xml:space="preserve">  │</w:t>
-        <w:br/>
-        <w:t xml:space="preserve">  ├── Proses Analisis Audio</w:t>
-        <w:br/>
-        <w:t xml:space="preserve">  │   ├── Load audio file (librosa)</w:t>
-        <w:br/>
-        <w:t xml:space="preserve">  │   ├── Ekstraksi fitur (BPM, RMS, SC, MFCC, Chroma)</w:t>
-        <w:br/>
-        <w:t xml:space="preserve">  │   ├── Beat tracking &amp; onset detection</w:t>
-        <w:br/>
-        <w:t xml:space="preserve">  │   ├── Normalisasi fitur [0,1]</w:t>
-        <w:br/>
-        <w:t xml:space="preserve">  │   ├── Perhitungan Valence &amp; Arousal (rule-based)</w:t>
-        <w:br/>
-        <w:t xml:space="preserve">  │   ├── Pemetaan V-A → HSV (rule-based mapping table)</w:t>
-        <w:br/>
-        <w:t xml:space="preserve">  │   ├── Konversi HSV → RGB → RGBW</w:t>
-        <w:br/>
-        <w:t xml:space="preserve">  │   └── Penerapan rules transisi (BPM, onset strength → timing)</w:t>
-        <w:br/>
-        <w:t xml:space="preserve">  │</w:t>
-        <w:br/>
-        <w:t xml:space="preserve">  ├── Tampilkan Hasil Analisis</w:t>
-        <w:br/>
-        <w:t xml:space="preserve">  │   ├── Grafik, diagram, spektrum, frekuensi</w:t>
-        <w:br/>
-        <w:t xml:space="preserve">  │   ├── Tabel Scene/Chase (DRGBW per lampu)</w:t>
-        <w:br/>
-        <w:t xml:space="preserve">  │   └── Preview warna</w:t>
-        <w:br/>
-        <w:t xml:space="preserve">  │</w:t>
-        <w:br/>
-        <w:t xml:space="preserve">  ├── User memilih output target</w:t>
-        <w:br/>
-        <w:t xml:space="preserve">  │   ├── Opsi A: Kirim ke QLC+ via Art-Net Virtual Adapter</w:t>
-        <w:br/>
-        <w:t xml:space="preserve">  │   └── Opsi B: Kirim langsung ke ESP32 via Art-Net WiFi</w:t>
-        <w:br/>
-        <w:t xml:space="preserve">  │</w:t>
-        <w:br/>
-        <w:t xml:space="preserve">  ├── Kirim data Art-Net (UDP port 6454)</w:t>
-        <w:br/>
-        <w:t xml:space="preserve">  │</w:t>
-        <w:br/>
-        <w:t>END</w:t>
-      </w:r>
-    </w:p>
-    <w:p>
-      <w:pPr>
         <w:jc w:val="both"/>
       </w:pPr>
       <w:r>
@@ -10512,88 +10189,14 @@
     </w:p>
     <w:p>
       <w:pPr>
-        <w:ind w:left="567"/>
-      </w:pPr>
-      <w:r>
-        <w:rPr>
-          <w:rFonts w:ascii="Courier New" w:hAnsi="Courier New"/>
-          <w:sz w:val="18"/>
-        </w:rPr>
-        <w:t>START</w:t>
-        <w:br/>
-        <w:t xml:space="preserve">  │</w:t>
-        <w:br/>
-        <w:t xml:space="preserve">  ├── Inisialisasi Hardware (LCD, MAX485, Serial2)</w:t>
-        <w:br/>
-        <w:t xml:space="preserve">  │</w:t>
-        <w:br/>
-        <w:t xml:space="preserve">  ├── Baca kredensial WiFi dari memori (Preferences)</w:t>
-        <w:br/>
-        <w:t xml:space="preserve">  │</w:t>
-        <w:br/>
-        <w:t xml:space="preserve">  ├── Kredensial ada?</w:t>
-        <w:br/>
-        <w:t xml:space="preserve">  │   ├── Ya → Hubungkan ke WiFi → Berhasil?</w:t>
-        <w:br/>
-        <w:t xml:space="preserve">  │   │       ├── Ya → Mode RUN (Art-Net Receiver aktif)</w:t>
-        <w:br/>
-        <w:t xml:space="preserve">  │   │       └── Tidak → Mode AP (Captive Portal)</w:t>
-        <w:br/>
-        <w:t xml:space="preserve">  │   └── Tidak → Mode AP (Captive Portal)</w:t>
-        <w:br/>
-        <w:t xml:space="preserve">  │</w:t>
-        <w:br/>
-        <w:t xml:space="preserve">  ├── Mode AP:</w:t>
-        <w:br/>
-        <w:t xml:space="preserve">  │   ├── Buat hotspot "ARTNET-DMX"</w:t>
-        <w:br/>
-        <w:t xml:space="preserve">  │   ├── DNS hijack → Captive Portal</w:t>
-        <w:br/>
-        <w:t xml:space="preserve">  │   ├── WebServer: Setup page (scan WiFi, input SSID/pass)</w:t>
-        <w:br/>
-        <w:t xml:space="preserve">  │   ├── Art-Net Receiver tetap aktif</w:t>
-        <w:br/>
-        <w:t xml:space="preserve">  │   └── Simpan kredensial → Reboot</w:t>
-        <w:br/>
-        <w:t xml:space="preserve">  │</w:t>
-        <w:br/>
-        <w:t xml:space="preserve">  ├── Mode RUN:</w:t>
-        <w:br/>
-        <w:t xml:space="preserve">  │   ├── Art-Net Receiver (UDP port 6454)</w:t>
-        <w:br/>
-        <w:t xml:space="preserve">  │   │   ├── Parse packet Art-Net</w:t>
-        <w:br/>
-        <w:t xml:space="preserve">  │   │   ├── Filter universe 0</w:t>
-        <w:br/>
-        <w:t xml:space="preserve">  │   │   └── Update data DMX</w:t>
-        <w:br/>
-        <w:t xml:space="preserve">  │   │</w:t>
-        <w:br/>
-        <w:t xml:space="preserve">  │   ├── DMX Output Task:</w:t>
-        <w:br/>
-        <w:t xml:space="preserve">  │   │   ├── Sinkronisasi data (buffer management)</w:t>
-        <w:br/>
-        <w:t xml:space="preserve">  │   │   ├── Kirim BREAK + START CODE + 512 byte DMX</w:t>
-        <w:br/>
-        <w:t xml:space="preserve">  │   │   ├── Auto-blackout jika no signal &gt;10s</w:t>
-        <w:br/>
-        <w:t xml:space="preserve">  │   │   └── Refresh rate sesuai standar DMX</w:t>
-        <w:br/>
-        <w:t xml:space="preserve">  │   │</w:t>
-        <w:br/>
-        <w:t xml:space="preserve">  │   ├── Auto-Reconnect WiFi:</w:t>
-        <w:br/>
-        <w:t xml:space="preserve">  │   │   ├── Disconnect &lt;30s → Reconnect</w:t>
-        <w:br/>
-        <w:t xml:space="preserve">  │   │   └── Disconnect &gt;30s → Reset + Reboot</w:t>
-        <w:br/>
-        <w:t xml:space="preserve">  │   │</w:t>
-        <w:br/>
-        <w:t xml:space="preserve">  │   └── WebServer: Monitor page (status real-time)</w:t>
-        <w:br/>
-        <w:t xml:space="preserve">  │</w:t>
-        <w:br/>
-        <w:t>END</w:t>
+        <w:spacing w:line="360" w:lineRule="auto" w:after="120"/>
+      </w:pPr>
+      <w:r>
+        <w:rPr>
+          <w:rFonts w:ascii="Times New Roman" w:hAnsi="Times New Roman"/>
+          <w:sz w:val="24"/>
+        </w:rPr>
+        <w:t>Modul penerima ARTNET-DMX berbasis ESP32 menjalankan dua proses konkuren pada inti prosesor terpisah (FreeRTOS Dual-Core): (1) Core 0 menangani protokol jaringan nirkabel (penerima paket Art-Net UDP port 6454, mode Station atau SoftAP Captive Portal 192.168.4.1), dan (2) Core 1 mengendalikan sinyal fisik DMX512 melalui Hardware Serial UART2 ke transceiver MAX485 pada laju 250.000 bps dengan fitur proteksi auto-blackout jika sinyal terputus.</w:t>
       </w:r>
     </w:p>
     <w:p>
@@ -13927,14 +13530,22 @@
     <w:p>
       <w:pPr>
         <w:jc w:val="center"/>
+        <w:spacing w:line="280" w:before="140" w:after="140"/>
       </w:pPr>
       <w:r>
         <w:rPr>
           <w:rFonts w:ascii="Cambria Math" w:hAnsi="Cambria Math"/>
           <w:i/>
-          <w:sz w:val="22"/>
-        </w:rPr>
-        <w:t>\text{Persentase Keberhasilan} = \frac{\text{Jumlah Test Case Pass}}{\text{Total Test Case}} \times 100\%</w:t>
+          <w:sz w:val="24"/>
+        </w:rPr>
+        <w:t>Persentase Keberhasilan = (Jumlah Test Case Pass / Total Test Case) × 100%</w:t>
+      </w:r>
+      <w:r>
+        <w:rPr>
+          <w:rFonts w:ascii="Times New Roman" w:hAnsi="Times New Roman"/>
+          <w:sz w:val="24"/>
+        </w:rPr>
+        <w:t>          (3.1)</w:t>
       </w:r>
     </w:p>
     <w:p>

</xml_diff>

<commit_message>
style(thesis): update Gambar 3.1 to strictly vertical top-to-bottom pipeline flowchart
- Transform Gambar 3.1 into a clean, perfectly centered, straight vertical column flowchart
- Adjust aspect ratios and dimensions (1:1 and vertical) for all 5 embedded B&W diagrams
- Recompile script_andreas_v4.docx (1.46 MB)

Co-Authored-By: Claude Code <noreply@anthropic.com>
</commit_message>
<xml_diff>
--- a/script_projects/script_andreas_v4.docx
+++ b/script_projects/script_andreas_v4.docx
@@ -5744,7 +5744,7 @@
       <w:r>
         <w:drawing>
           <wp:inline distT="0" distB="0" distL="0" distR="0">
-            <wp:extent cx="4800000" cy="3000000"/>
+            <wp:extent cx="4300000" cy="4300000"/>
             <wp:effectExtent l="0" t="0" r="0" b="0"/>
             <wp:docPr id="10" name="Picture 10"/>
             <wp:cNvGraphicFramePr>
@@ -5766,7 +5766,7 @@
                   <pic:spPr>
                     <a:xfrm>
                       <a:off x="0" y="0"/>
-                      <a:ext cx="4800000" cy="3000000"/>
+                      <a:ext cx="4300000" cy="4300000"/>
                     </a:xfrm>
                     <a:prstGeom prst="rect">
                       <a:avLst/>
@@ -6508,7 +6508,7 @@
       <w:r>
         <w:drawing>
           <wp:inline distT="0" distB="0" distL="0" distR="0">
-            <wp:extent cx="4800000" cy="3000000"/>
+            <wp:extent cx="4200000" cy="4200000"/>
             <wp:effectExtent l="0" t="0" r="0" b="0"/>
             <wp:docPr id="11" name="Picture 11"/>
             <wp:cNvGraphicFramePr>
@@ -6530,7 +6530,7 @@
                   <pic:spPr>
                     <a:xfrm>
                       <a:off x="0" y="0"/>
-                      <a:ext cx="4800000" cy="3000000"/>
+                      <a:ext cx="4200000" cy="4200000"/>
                     </a:xfrm>
                     <a:prstGeom prst="rect">
                       <a:avLst/>
@@ -7365,7 +7365,7 @@
       <w:r>
         <w:drawing>
           <wp:inline distT="0" distB="0" distL="0" distR="0">
-            <wp:extent cx="4800000" cy="3000000"/>
+            <wp:extent cx="4200000" cy="4200000"/>
             <wp:effectExtent l="0" t="0" r="0" b="0"/>
             <wp:docPr id="12" name="Picture 12"/>
             <wp:cNvGraphicFramePr>
@@ -7387,7 +7387,7 @@
                   <pic:spPr>
                     <a:xfrm>
                       <a:off x="0" y="0"/>
-                      <a:ext cx="4800000" cy="3000000"/>
+                      <a:ext cx="4200000" cy="4200000"/>
                     </a:xfrm>
                     <a:prstGeom prst="rect">
                       <a:avLst/>
@@ -9218,7 +9218,7 @@
       <w:r>
         <w:drawing>
           <wp:inline distT="0" distB="0" distL="0" distR="0">
-            <wp:extent cx="4800000" cy="3000000"/>
+            <wp:extent cx="4300000" cy="4300000"/>
             <wp:effectExtent l="0" t="0" r="0" b="0"/>
             <wp:docPr id="13" name="Picture 13"/>
             <wp:cNvGraphicFramePr>
@@ -9240,7 +9240,7 @@
                   <pic:spPr>
                     <a:xfrm>
                       <a:off x="0" y="0"/>
-                      <a:ext cx="4800000" cy="3000000"/>
+                      <a:ext cx="4300000" cy="4300000"/>
                     </a:xfrm>
                     <a:prstGeom prst="rect">
                       <a:avLst/>
@@ -10118,7 +10118,7 @@
       <w:r>
         <w:drawing>
           <wp:inline distT="0" distB="0" distL="0" distR="0">
-            <wp:extent cx="4800000" cy="3000000"/>
+            <wp:extent cx="3900000" cy="4600000"/>
             <wp:effectExtent l="0" t="0" r="0" b="0"/>
             <wp:docPr id="14" name="Picture 14"/>
             <wp:cNvGraphicFramePr>
@@ -10140,7 +10140,7 @@
                   <pic:spPr>
                     <a:xfrm>
                       <a:off x="0" y="0"/>
-                      <a:ext cx="4800000" cy="3000000"/>
+                      <a:ext cx="3900000" cy="4600000"/>
                     </a:xfrm>
                     <a:prstGeom prst="rect">
                       <a:avLst/>

</xml_diff>

<commit_message>
feat(docs): embed 3 IEEE B&W supporting diagrams (hardware schematic, firmware flowchart, church stage layout) into proposal v4
- Add Gambar 3.2: Skematik Rangkaian Elektronika Hardware ESP32 + MAX485 + LCD + XLR
- Add Gambar 3.3: Diagram Alir Arsitektur Firmware ESP32 Dual-Core FreeRTOS
- Add Gambar 3.4: Denah Tata Letak Panggung & Topologi Pengujian Lapangan GIA Deliksari
- Clean Subbab 2.2.1 table artifact leaving 0 raw formulas
- Update script_andreas_v4.docx (2.58 MB) and script_chapter_03.md

Co-Authored-By: Claude Code <noreply@anthropic.com>
</commit_message>
<xml_diff>
--- a/script_projects/script_andreas_v4.docx
+++ b/script_projects/script_andreas_v4.docx
@@ -6199,65 +6199,6 @@
         <w:t>          (2.14)</w:t>
       </w:r>
     </w:p>
-    <w:tbl>
-      <w:tblPr>
-        <w:tblStyle w:val="TableGrid"/>
-        <w:tblW w:type="auto" w:w="0"/>
-        <w:tblLook w:firstColumn="1" w:firstRow="1" w:lastColumn="0" w:lastRow="0" w:noHBand="0" w:noVBand="1" w:val="04A0"/>
-      </w:tblPr>
-      <w:tblGrid>
-        <w:gridCol w:w="2757"/>
-        <w:gridCol w:w="2757"/>
-        <w:gridCol w:w="2757"/>
-      </w:tblGrid>
-      <w:tr>
-        <w:tc>
-          <w:tcPr>
-            <w:tcW w:type="dxa" w:w="2757"/>
-          </w:tcPr>
-          <w:p>
-            <w:r>
-              <w:rPr>
-                <w:rFonts w:ascii="Times New Roman" w:hAnsi="Times New Roman"/>
-                <w:b/>
-                <w:sz w:val="20"/>
-              </w:rPr>
-              <w:t>X(k)</w:t>
-            </w:r>
-          </w:p>
-        </w:tc>
-        <w:tc>
-          <w:tcPr>
-            <w:tcW w:type="dxa" w:w="2757"/>
-          </w:tcPr>
-          <w:p>
-            <w:r>
-              <w:rPr>
-                <w:rFonts w:ascii="Times New Roman" w:hAnsi="Times New Roman"/>
-                <w:b/>
-                <w:sz w:val="20"/>
-              </w:rPr>
-              <w:t>^2}{∑_{k=1}^{K}</w:t>
-            </w:r>
-          </w:p>
-        </w:tc>
-        <w:tc>
-          <w:tcPr>
-            <w:tcW w:type="dxa" w:w="2757"/>
-          </w:tcPr>
-          <w:p>
-            <w:r>
-              <w:rPr>
-                <w:rFonts w:ascii="Times New Roman" w:hAnsi="Times New Roman"/>
-                <w:b/>
-                <w:sz w:val="20"/>
-              </w:rPr>
-              <w:t>X(k)</w:t>
-            </w:r>
-          </w:p>
-        </w:tc>
-      </w:tr>
-    </w:tbl>
     <w:p>
       <w:pPr>
         <w:spacing w:before="120" w:after="80"/>
@@ -10196,7 +10137,147 @@
           <w:rFonts w:ascii="Times New Roman" w:hAnsi="Times New Roman"/>
           <w:sz w:val="24"/>
         </w:rPr>
-        <w:t>Modul penerima ARTNET-DMX berbasis ESP32 menjalankan dua proses konkuren pada inti prosesor terpisah (FreeRTOS Dual-Core): (1) Core 0 menangani protokol jaringan nirkabel (penerima paket Art-Net UDP port 6454, mode Station atau SoftAP Captive Portal 192.168.4.1), dan (2) Core 1 mengendalikan sinyal fisik DMX512 melalui Hardware Serial UART2 ke transceiver MAX485 pada laju 250.000 bps dengan fitur proteksi auto-blackout jika sinyal terputus.</w:t>
+        <w:t>Rangkaian perangkat keras modul penerima ARTNET-DMX Node dirancang menggunakan mikrokontroler ESP32 DevKit V1 yang dihubungkan ke modul transceiver RS-485 MAX485 untuk membangkitkan sinyal diferensial DMX512 fisik ke konektor XLR 3-pin, serta modul LCD 16×2 dengan antarmuka I2C PCF8574 sebagai penampil status operasional. Skematik interkoneksi pengkabelan pin disajikan pada Gambar 3.2.</w:t>
+      </w:r>
+    </w:p>
+    <w:p>
+      <w:pPr>
+        <w:jc w:val="center"/>
+        <w:spacing w:before="240" w:after="120"/>
+      </w:pPr>
+      <w:r>
+        <w:drawing>
+          <wp:inline distT="0" distB="0" distL="0" distR="0">
+            <wp:extent cx="4400000" cy="4400000"/>
+            <wp:effectExtent l="0" t="0" r="0" b="0"/>
+            <wp:docPr id="15" name="Picture 15"/>
+            <wp:cNvGraphicFramePr>
+              <a:graphicFrameLocks noChangeAspect="1"/>
+            </wp:cNvGraphicFramePr>
+            <a:graphic>
+              <a:graphicData uri="http://schemas.openxmlformats.org/drawingml/2006/main/picture">
+                <pic:pic>
+                  <pic:nvPicPr>
+                    <pic:cNvPr id="15" name="Image 15"/>
+                    <pic:cNvPicPr/>
+                  </pic:nvPicPr>
+                  <pic:blipFill>
+                    <a:blip r:embed="rId15"/>
+                    <a:stretch>
+                      <a:fillRect/>
+                    </a:stretch>
+                  </pic:blipFill>
+                  <pic:spPr>
+                    <a:xfrm>
+                      <a:off x="0" y="0"/>
+                      <a:ext cx="4400000" cy="4400000"/>
+                    </a:xfrm>
+                    <a:prstGeom prst="rect">
+                      <a:avLst/>
+                    </a:prstGeom>
+                  </pic:spPr>
+                </pic:pic>
+              </a:graphicData>
+            </a:graphic>
+          </wp:inline>
+        </w:drawing>
+      </w:r>
+    </w:p>
+    <w:p>
+      <w:pPr>
+        <w:jc w:val="center"/>
+        <w:spacing w:line="240" w:lineRule="auto" w:after="240"/>
+      </w:pPr>
+      <w:r>
+        <w:rPr>
+          <w:rFonts w:ascii="Times New Roman" w:hAnsi="Times New Roman"/>
+          <w:b/>
+          <w:sz w:val="22"/>
+        </w:rPr>
+        <w:t>Gambar 3.2 </w:t>
+      </w:r>
+      <w:r>
+        <w:rPr>
+          <w:rFonts w:ascii="Times New Roman" w:hAnsi="Times New Roman"/>
+          <w:sz w:val="22"/>
+        </w:rPr>
+        <w:t>Skematik Rangkaian Elektronika Modul Penerima ARTNET-DMX Node Berbasis ESP32 DevKit V1, Transceiver MAX485, Display LCD 16×2 I2C, dan Port Output DMX512 XLR 3-Pin</w:t>
+      </w:r>
+    </w:p>
+    <w:p>
+      <w:pPr>
+        <w:spacing w:line="360" w:lineRule="auto" w:after="120"/>
+      </w:pPr>
+      <w:r>
+        <w:rPr>
+          <w:rFonts w:ascii="Times New Roman" w:hAnsi="Times New Roman"/>
+          <w:sz w:val="24"/>
+        </w:rPr>
+        <w:t>Modul penerima ARTNET-DMX berbasis ESP32 menjalankan dua proses konkuren pada inti prosesor terpisah (FreeRTOS Dual-Core): (1) Core 0 menangani protokol jaringan nirkabel (penerima paket Art-Net UDP port 6454, mode Station atau SoftAP Captive Portal 192.168.4.1), dan (2) Core 1 mengendalikan sinyal fisik DMX512 melalui Hardware Serial UART2 ke transceiver MAX485 pada laju 250.000 bps dengan fitur proteksi auto-blackout jika sinyal terputus. Diagram alir arsitektur firmware dual-core disajikan pada Gambar 3.3.</w:t>
+      </w:r>
+    </w:p>
+    <w:p>
+      <w:pPr>
+        <w:jc w:val="center"/>
+        <w:spacing w:before="240" w:after="120"/>
+      </w:pPr>
+      <w:r>
+        <w:drawing>
+          <wp:inline distT="0" distB="0" distL="0" distR="0">
+            <wp:extent cx="4300000" cy="4700000"/>
+            <wp:effectExtent l="0" t="0" r="0" b="0"/>
+            <wp:docPr id="16" name="Picture 16"/>
+            <wp:cNvGraphicFramePr>
+              <a:graphicFrameLocks noChangeAspect="1"/>
+            </wp:cNvGraphicFramePr>
+            <a:graphic>
+              <a:graphicData uri="http://schemas.openxmlformats.org/drawingml/2006/main/picture">
+                <pic:pic>
+                  <pic:nvPicPr>
+                    <pic:cNvPr id="16" name="Image 16"/>
+                    <pic:cNvPicPr/>
+                  </pic:nvPicPr>
+                  <pic:blipFill>
+                    <a:blip r:embed="rId16"/>
+                    <a:stretch>
+                      <a:fillRect/>
+                    </a:stretch>
+                  </pic:blipFill>
+                  <pic:spPr>
+                    <a:xfrm>
+                      <a:off x="0" y="0"/>
+                      <a:ext cx="4300000" cy="4700000"/>
+                    </a:xfrm>
+                    <a:prstGeom prst="rect">
+                      <a:avLst/>
+                    </a:prstGeom>
+                  </pic:spPr>
+                </pic:pic>
+              </a:graphicData>
+            </a:graphic>
+          </wp:inline>
+        </w:drawing>
+      </w:r>
+    </w:p>
+    <w:p>
+      <w:pPr>
+        <w:jc w:val="center"/>
+        <w:spacing w:line="240" w:lineRule="auto" w:after="240"/>
+      </w:pPr>
+      <w:r>
+        <w:rPr>
+          <w:rFonts w:ascii="Times New Roman" w:hAnsi="Times New Roman"/>
+          <w:b/>
+          <w:sz w:val="22"/>
+        </w:rPr>
+        <w:t>Gambar 3.3 </w:t>
+      </w:r>
+      <w:r>
+        <w:rPr>
+          <w:rFonts w:ascii="Times New Roman" w:hAnsi="Times New Roman"/>
+          <w:sz w:val="22"/>
+        </w:rPr>
+        <w:t>Diagram Alir Arsitektur Firmware ESP32 Dual-Core FreeRTOS (Core 0: Network &amp; Web Task; Core 1: Hardware DMX512 Transmission Driver &amp; Fail-Safe Auto-Blackout Task)</w:t>
       </w:r>
     </w:p>
     <w:p>
@@ -10378,6 +10459,82 @@
           <w:sz w:val="24"/>
         </w:rPr>
         <w:t xml:space="preserve"> dengan lampu PAR LED RGBW, pengambilan data responden, dan evaluasi kesesuaian pencahayaan dalam konteks ibadah.</w:t>
+      </w:r>
+    </w:p>
+    <w:p>
+      <w:pPr>
+        <w:spacing w:line="360" w:lineRule="auto" w:after="120"/>
+      </w:pPr>
+      <w:r>
+        <w:rPr>
+          <w:rFonts w:ascii="Times New Roman" w:hAnsi="Times New Roman"/>
+          <w:sz w:val="24"/>
+        </w:rPr>
+        <w:t>Tata letak penempatan perangkat keras, pengkabelan rantai daisy DMX512, pemancar nirkabel Art-Net 4, serta posisi pengamatan 25 responden di ruang ibadah Gereja GIA Deliksari Semarang diilustrasikan secara spasial pada Gambar 3.4.</w:t>
+      </w:r>
+    </w:p>
+    <w:p>
+      <w:pPr>
+        <w:jc w:val="center"/>
+        <w:spacing w:before="240" w:after="120"/>
+      </w:pPr>
+      <w:r>
+        <w:drawing>
+          <wp:inline distT="0" distB="0" distL="0" distR="0">
+            <wp:extent cx="4400000" cy="4400000"/>
+            <wp:effectExtent l="0" t="0" r="0" b="0"/>
+            <wp:docPr id="17" name="Picture 17"/>
+            <wp:cNvGraphicFramePr>
+              <a:graphicFrameLocks noChangeAspect="1"/>
+            </wp:cNvGraphicFramePr>
+            <a:graphic>
+              <a:graphicData uri="http://schemas.openxmlformats.org/drawingml/2006/main/picture">
+                <pic:pic>
+                  <pic:nvPicPr>
+                    <pic:cNvPr id="17" name="Image 17"/>
+                    <pic:cNvPicPr/>
+                  </pic:nvPicPr>
+                  <pic:blipFill>
+                    <a:blip r:embed="rId17"/>
+                    <a:stretch>
+                      <a:fillRect/>
+                    </a:stretch>
+                  </pic:blipFill>
+                  <pic:spPr>
+                    <a:xfrm>
+                      <a:off x="0" y="0"/>
+                      <a:ext cx="4400000" cy="4400000"/>
+                    </a:xfrm>
+                    <a:prstGeom prst="rect">
+                      <a:avLst/>
+                    </a:prstGeom>
+                  </pic:spPr>
+                </pic:pic>
+              </a:graphicData>
+            </a:graphic>
+          </wp:inline>
+        </w:drawing>
+      </w:r>
+    </w:p>
+    <w:p>
+      <w:pPr>
+        <w:jc w:val="center"/>
+        <w:spacing w:line="240" w:lineRule="auto" w:after="240"/>
+      </w:pPr>
+      <w:r>
+        <w:rPr>
+          <w:rFonts w:ascii="Times New Roman" w:hAnsi="Times New Roman"/>
+          <w:b/>
+          <w:sz w:val="22"/>
+        </w:rPr>
+        <w:t>Gambar 3.4 </w:t>
+      </w:r>
+      <w:r>
+        <w:rPr>
+          <w:rFonts w:ascii="Times New Roman" w:hAnsi="Times New Roman"/>
+          <w:sz w:val="22"/>
+        </w:rPr>
+        <w:t>Denah Tata Letak Panggung, Pengkabelan DMX512 Daisy-Chain, Topologi Jaringan Nirkabel Art-Net, dan Posisi Responden pada Pengujian Lapangan di Gereja GIA Deliksari Semarang</w:t>
       </w:r>
     </w:p>
     <w:p>

</xml_diff>